<commit_message>
chore: atualizacao automatica 2026-09-14
</commit_message>
<xml_diff>
--- a/relatorio_executivo.docx
+++ b/relatorio_executivo.docx
@@ -46,7 +46,7 @@
           <w:sz w:val="17"/>
           <w:szCs w:val="17"/>
         </w:rPr>
-        <w:t xml:space="preserve">Equipe de Planejamento, Controle e Pesquisa Florestal  ·  Referência: Set/2026  ·  Gerado em 08/09/2026, 11:48:32</w:t>
+        <w:t xml:space="preserve">Equipe de Planejamento, Controle e Pesquisa Florestal  ·  Referência: Set/2026  ·  Gerado em 14/09/2026, 16:07:22</w:t>
       </w:r>
     </w:p>
     <w:p>
@@ -91,14 +91,14 @@
           <w:sz w:val="19"/>
           <w:szCs w:val="19"/>
         </w:rPr>
-        <w:t xml:space="preserve">O dólar está em R$ 5,13 (0,0%) e a soja CEPEA em R$ 152,10/saca. </w:t>
+        <w:t xml:space="preserve">O dólar está em R$ 5,09 (-0,8%) e a soja CEPEA em R$ 152,82/saca. </w:t>
       </w:r>
       <w:r>
         <w:rPr>
           <w:sz w:val="19"/>
           <w:szCs w:val="19"/>
         </w:rPr>
-        <w:t xml:space="preserve">A relação de troca soja/MAP é de 28,9 sacas/t.</w:t>
+        <w:t xml:space="preserve">A relação de troca soja/MAP é de 28,6 sacas/t.</w:t>
       </w:r>
     </w:p>
     <w:p>
@@ -864,7 +864,7 @@
                 <w:sz w:val="18"/>
                 <w:szCs w:val="18"/>
               </w:rPr>
-              <w:t xml:space="preserve">R$ 152,10/sc</w:t>
+              <w:t xml:space="preserve">R$ 152,82/sc</w:t>
             </w:r>
           </w:p>
         </w:tc>
@@ -893,11 +893,11 @@
               <w:rPr>
                 <w:b/>
                 <w:bCs/>
-                <w:color w:val="6B7585"/>
-                <w:sz w:val="18"/>
-                <w:szCs w:val="18"/>
-              </w:rPr>
-              <w:t xml:space="preserve">0,0%</w:t>
+                <w:color w:val="2F8A5F"/>
+                <w:sz w:val="18"/>
+                <w:szCs w:val="18"/>
+              </w:rPr>
+              <w:t xml:space="preserve">+0,5%</w:t>
             </w:r>
           </w:p>
         </w:tc>
@@ -989,7 +989,7 @@
                 <w:sz w:val="18"/>
                 <w:szCs w:val="18"/>
               </w:rPr>
-              <w:t xml:space="preserve">R$ 144,75/sc</w:t>
+              <w:t xml:space="preserve">R$ 149,00/sc</w:t>
             </w:r>
           </w:p>
         </w:tc>
@@ -1018,11 +1018,11 @@
               <w:rPr>
                 <w:b/>
                 <w:bCs/>
-                <w:color w:val="6B7585"/>
-                <w:sz w:val="18"/>
-                <w:szCs w:val="18"/>
-              </w:rPr>
-              <w:t xml:space="preserve">0,0%</w:t>
+                <w:color w:val="2F8A5F"/>
+                <w:sz w:val="18"/>
+                <w:szCs w:val="18"/>
+              </w:rPr>
+              <w:t xml:space="preserve">+2,9%</w:t>
             </w:r>
           </w:p>
         </w:tc>
@@ -1114,7 +1114,7 @@
                 <w:sz w:val="18"/>
                 <w:szCs w:val="18"/>
               </w:rPr>
-              <w:t xml:space="preserve">28,9 sc/t</w:t>
+              <w:t xml:space="preserve">28,6 sc/t</w:t>
             </w:r>
           </w:p>
         </w:tc>
@@ -1143,11 +1143,11 @@
               <w:rPr>
                 <w:b/>
                 <w:bCs/>
-                <w:color w:val="6B7585"/>
-                <w:sz w:val="18"/>
-                <w:szCs w:val="18"/>
-              </w:rPr>
-              <w:t xml:space="preserve">0,0%</w:t>
+                <w:color w:val="2F8A5F"/>
+                <w:sz w:val="18"/>
+                <w:szCs w:val="18"/>
+              </w:rPr>
+              <w:t xml:space="preserve">-1,0%</w:t>
             </w:r>
           </w:p>
         </w:tc>
@@ -1177,7 +1177,7 @@
                 <w:sz w:val="17"/>
                 <w:szCs w:val="17"/>
               </w:rPr>
-              <w:t xml:space="preserve">Piora</w:t>
+              <w:t xml:space="preserve">Melhora</w:t>
             </w:r>
           </w:p>
         </w:tc>
@@ -1239,7 +1239,7 @@
                 <w:sz w:val="18"/>
                 <w:szCs w:val="18"/>
               </w:rPr>
-              <w:t xml:space="preserve">14,6 sc/t</w:t>
+              <w:t xml:space="preserve">14,4 sc/t</w:t>
             </w:r>
           </w:p>
         </w:tc>
@@ -1528,257 +1528,7 @@
                 <w:sz w:val="18"/>
                 <w:szCs w:val="18"/>
               </w:rPr>
-              <w:t xml:space="preserve">5,13</w:t>
-            </w:r>
-          </w:p>
-        </w:tc>
-        <w:tc>
-          <w:tcPr>
-            <w:tcW w:type="dxa" w:w="1980"/>
-            <w:tcBorders>
-              <w:top w:val="single" w:color="DDDDDD" w:sz="1"/>
-              <w:left w:val="single" w:color="DDDDDD" w:sz="1"/>
-              <w:bottom w:val="single" w:color="DDDDDD" w:sz="1"/>
-              <w:right w:val="single" w:color="DDDDDD" w:sz="1"/>
-            </w:tcBorders>
-            <w:tcMar>
-              <w:top w:type="dxa" w:w="55"/>
-              <w:left w:type="dxa" w:w="110"/>
-              <w:bottom w:type="dxa" w:w="55"/>
-              <w:right w:type="dxa" w:w="110"/>
-            </w:tcMar>
-            <w:vAlign w:val="center"/>
-          </w:tcPr>
-          <w:p>
-            <w:pPr>
-              <w:jc w:val="right"/>
-            </w:pPr>
-            <w:r>
-              <w:rPr>
-                <w:b/>
-                <w:bCs/>
-                <w:color w:val="6B7585"/>
-                <w:sz w:val="18"/>
-                <w:szCs w:val="18"/>
-              </w:rPr>
-              <w:t xml:space="preserve">0,0%</w:t>
-            </w:r>
-          </w:p>
-        </w:tc>
-        <w:tc>
-          <w:tcPr>
-            <w:tcW w:type="dxa" w:w="2000"/>
-            <w:tcBorders>
-              <w:top w:val="single" w:color="DDDDDD" w:sz="1"/>
-              <w:left w:val="single" w:color="DDDDDD" w:sz="1"/>
-              <w:bottom w:val="single" w:color="DDDDDD" w:sz="1"/>
-              <w:right w:val="single" w:color="DDDDDD" w:sz="1"/>
-            </w:tcBorders>
-            <w:tcMar>
-              <w:top w:type="dxa" w:w="55"/>
-              <w:left w:type="dxa" w:w="110"/>
-              <w:bottom w:type="dxa" w:w="55"/>
-              <w:right w:type="dxa" w:w="110"/>
-            </w:tcMar>
-            <w:vAlign w:val="center"/>
-          </w:tcPr>
-          <w:p>
-            <w:pPr>
-              <w:jc w:val="left"/>
-            </w:pPr>
-            <w:r>
-              <w:rPr>
-                <w:sz w:val="17"/>
-                <w:szCs w:val="17"/>
-              </w:rPr>
-              <w:t xml:space="preserve">Custo de importação</w:t>
-            </w:r>
-          </w:p>
-        </w:tc>
-      </w:tr>
-      <w:tr>
-        <w:tc>
-          <w:tcPr>
-            <w:tcW w:type="dxa" w:w="3400"/>
-            <w:tcBorders>
-              <w:top w:val="single" w:color="DDDDDD" w:sz="1"/>
-              <w:left w:val="single" w:color="DDDDDD" w:sz="1"/>
-              <w:bottom w:val="single" w:color="DDDDDD" w:sz="1"/>
-              <w:right w:val="single" w:color="DDDDDD" w:sz="1"/>
-            </w:tcBorders>
-            <w:tcMar>
-              <w:top w:type="dxa" w:w="55"/>
-              <w:left w:type="dxa" w:w="110"/>
-              <w:bottom w:type="dxa" w:w="55"/>
-              <w:right w:type="dxa" w:w="110"/>
-            </w:tcMar>
-            <w:vAlign w:val="center"/>
-          </w:tcPr>
-          <w:p>
-            <w:pPr>
-              <w:jc w:val="left"/>
-            </w:pPr>
-            <w:r>
-              <w:rPr>
-                <w:sz w:val="18"/>
-                <w:szCs w:val="18"/>
-              </w:rPr>
-              <w:t xml:space="preserve">Gás Natural (Henry Hub)</w:t>
-            </w:r>
-          </w:p>
-        </w:tc>
-        <w:tc>
-          <w:tcPr>
-            <w:tcW w:type="dxa" w:w="1980"/>
-            <w:tcBorders>
-              <w:top w:val="single" w:color="DDDDDD" w:sz="1"/>
-              <w:left w:val="single" w:color="DDDDDD" w:sz="1"/>
-              <w:bottom w:val="single" w:color="DDDDDD" w:sz="1"/>
-              <w:right w:val="single" w:color="DDDDDD" w:sz="1"/>
-            </w:tcBorders>
-            <w:tcMar>
-              <w:top w:type="dxa" w:w="55"/>
-              <w:left w:type="dxa" w:w="110"/>
-              <w:bottom w:type="dxa" w:w="55"/>
-              <w:right w:type="dxa" w:w="110"/>
-            </w:tcMar>
-            <w:vAlign w:val="center"/>
-          </w:tcPr>
-          <w:p>
-            <w:pPr>
-              <w:jc w:val="right"/>
-            </w:pPr>
-            <w:r>
-              <w:rPr>
-                <w:sz w:val="18"/>
-                <w:szCs w:val="18"/>
-              </w:rPr>
-              <w:t xml:space="preserve">US$ 2,90</w:t>
-            </w:r>
-          </w:p>
-        </w:tc>
-        <w:tc>
-          <w:tcPr>
-            <w:tcW w:type="dxa" w:w="1980"/>
-            <w:tcBorders>
-              <w:top w:val="single" w:color="DDDDDD" w:sz="1"/>
-              <w:left w:val="single" w:color="DDDDDD" w:sz="1"/>
-              <w:bottom w:val="single" w:color="DDDDDD" w:sz="1"/>
-              <w:right w:val="single" w:color="DDDDDD" w:sz="1"/>
-            </w:tcBorders>
-            <w:tcMar>
-              <w:top w:type="dxa" w:w="55"/>
-              <w:left w:type="dxa" w:w="110"/>
-              <w:bottom w:type="dxa" w:w="55"/>
-              <w:right w:type="dxa" w:w="110"/>
-            </w:tcMar>
-            <w:vAlign w:val="center"/>
-          </w:tcPr>
-          <w:p>
-            <w:pPr>
-              <w:jc w:val="right"/>
-            </w:pPr>
-            <w:r>
-              <w:rPr>
-                <w:b/>
-                <w:bCs/>
-                <w:color w:val="6B7585"/>
-                <w:sz w:val="18"/>
-                <w:szCs w:val="18"/>
-              </w:rPr>
-              <w:t xml:space="preserve">0,0%</w:t>
-            </w:r>
-          </w:p>
-        </w:tc>
-        <w:tc>
-          <w:tcPr>
-            <w:tcW w:type="dxa" w:w="2000"/>
-            <w:tcBorders>
-              <w:top w:val="single" w:color="DDDDDD" w:sz="1"/>
-              <w:left w:val="single" w:color="DDDDDD" w:sz="1"/>
-              <w:bottom w:val="single" w:color="DDDDDD" w:sz="1"/>
-              <w:right w:val="single" w:color="DDDDDD" w:sz="1"/>
-            </w:tcBorders>
-            <w:tcMar>
-              <w:top w:type="dxa" w:w="55"/>
-              <w:left w:type="dxa" w:w="110"/>
-              <w:bottom w:type="dxa" w:w="55"/>
-              <w:right w:type="dxa" w:w="110"/>
-            </w:tcMar>
-            <w:vAlign w:val="center"/>
-          </w:tcPr>
-          <w:p>
-            <w:pPr>
-              <w:jc w:val="left"/>
-            </w:pPr>
-            <w:r>
-              <w:rPr>
-                <w:sz w:val="17"/>
-                <w:szCs w:val="17"/>
-              </w:rPr>
-              <w:t xml:space="preserve">Pressiona ureia</w:t>
-            </w:r>
-          </w:p>
-        </w:tc>
-      </w:tr>
-      <w:tr>
-        <w:tc>
-          <w:tcPr>
-            <w:tcW w:type="dxa" w:w="3400"/>
-            <w:tcBorders>
-              <w:top w:val="single" w:color="DDDDDD" w:sz="1"/>
-              <w:left w:val="single" w:color="DDDDDD" w:sz="1"/>
-              <w:bottom w:val="single" w:color="DDDDDD" w:sz="1"/>
-              <w:right w:val="single" w:color="DDDDDD" w:sz="1"/>
-            </w:tcBorders>
-            <w:tcMar>
-              <w:top w:type="dxa" w:w="55"/>
-              <w:left w:type="dxa" w:w="110"/>
-              <w:bottom w:type="dxa" w:w="55"/>
-              <w:right w:type="dxa" w:w="110"/>
-            </w:tcMar>
-            <w:vAlign w:val="center"/>
-          </w:tcPr>
-          <w:p>
-            <w:pPr>
-              <w:jc w:val="left"/>
-            </w:pPr>
-            <w:r>
-              <w:rPr>
-                <w:sz w:val="18"/>
-                <w:szCs w:val="18"/>
-              </w:rPr>
-              <w:t xml:space="preserve">Frete Marítimo (BDI)</w:t>
-            </w:r>
-          </w:p>
-        </w:tc>
-        <w:tc>
-          <w:tcPr>
-            <w:tcW w:type="dxa" w:w="1980"/>
-            <w:tcBorders>
-              <w:top w:val="single" w:color="DDDDDD" w:sz="1"/>
-              <w:left w:val="single" w:color="DDDDDD" w:sz="1"/>
-              <w:bottom w:val="single" w:color="DDDDDD" w:sz="1"/>
-              <w:right w:val="single" w:color="DDDDDD" w:sz="1"/>
-            </w:tcBorders>
-            <w:tcMar>
-              <w:top w:type="dxa" w:w="55"/>
-              <w:left w:type="dxa" w:w="110"/>
-              <w:bottom w:type="dxa" w:w="55"/>
-              <w:right w:type="dxa" w:w="110"/>
-            </w:tcMar>
-            <w:vAlign w:val="center"/>
-          </w:tcPr>
-          <w:p>
-            <w:pPr>
-              <w:jc w:val="right"/>
-            </w:pPr>
-            <w:r>
-              <w:rPr>
-                <w:sz w:val="18"/>
-                <w:szCs w:val="18"/>
-              </w:rPr>
-              <w:t xml:space="preserve">3.575 pts</w:t>
+              <w:t xml:space="preserve">5,09</w:t>
             </w:r>
           </w:p>
         </w:tc>
@@ -1811,7 +1561,257 @@
                 <w:sz w:val="18"/>
                 <w:szCs w:val="18"/>
               </w:rPr>
-              <w:t xml:space="preserve">-1,5%</w:t>
+              <w:t xml:space="preserve">-0,8%</w:t>
+            </w:r>
+          </w:p>
+        </w:tc>
+        <w:tc>
+          <w:tcPr>
+            <w:tcW w:type="dxa" w:w="2000"/>
+            <w:tcBorders>
+              <w:top w:val="single" w:color="DDDDDD" w:sz="1"/>
+              <w:left w:val="single" w:color="DDDDDD" w:sz="1"/>
+              <w:bottom w:val="single" w:color="DDDDDD" w:sz="1"/>
+              <w:right w:val="single" w:color="DDDDDD" w:sz="1"/>
+            </w:tcBorders>
+            <w:tcMar>
+              <w:top w:type="dxa" w:w="55"/>
+              <w:left w:type="dxa" w:w="110"/>
+              <w:bottom w:type="dxa" w:w="55"/>
+              <w:right w:type="dxa" w:w="110"/>
+            </w:tcMar>
+            <w:vAlign w:val="center"/>
+          </w:tcPr>
+          <w:p>
+            <w:pPr>
+              <w:jc w:val="left"/>
+            </w:pPr>
+            <w:r>
+              <w:rPr>
+                <w:sz w:val="17"/>
+                <w:szCs w:val="17"/>
+              </w:rPr>
+              <w:t xml:space="preserve">Custo de importação</w:t>
+            </w:r>
+          </w:p>
+        </w:tc>
+      </w:tr>
+      <w:tr>
+        <w:tc>
+          <w:tcPr>
+            <w:tcW w:type="dxa" w:w="3400"/>
+            <w:tcBorders>
+              <w:top w:val="single" w:color="DDDDDD" w:sz="1"/>
+              <w:left w:val="single" w:color="DDDDDD" w:sz="1"/>
+              <w:bottom w:val="single" w:color="DDDDDD" w:sz="1"/>
+              <w:right w:val="single" w:color="DDDDDD" w:sz="1"/>
+            </w:tcBorders>
+            <w:tcMar>
+              <w:top w:type="dxa" w:w="55"/>
+              <w:left w:type="dxa" w:w="110"/>
+              <w:bottom w:type="dxa" w:w="55"/>
+              <w:right w:type="dxa" w:w="110"/>
+            </w:tcMar>
+            <w:vAlign w:val="center"/>
+          </w:tcPr>
+          <w:p>
+            <w:pPr>
+              <w:jc w:val="left"/>
+            </w:pPr>
+            <w:r>
+              <w:rPr>
+                <w:sz w:val="18"/>
+                <w:szCs w:val="18"/>
+              </w:rPr>
+              <w:t xml:space="preserve">Gás Natural (Henry Hub)</w:t>
+            </w:r>
+          </w:p>
+        </w:tc>
+        <w:tc>
+          <w:tcPr>
+            <w:tcW w:type="dxa" w:w="1980"/>
+            <w:tcBorders>
+              <w:top w:val="single" w:color="DDDDDD" w:sz="1"/>
+              <w:left w:val="single" w:color="DDDDDD" w:sz="1"/>
+              <w:bottom w:val="single" w:color="DDDDDD" w:sz="1"/>
+              <w:right w:val="single" w:color="DDDDDD" w:sz="1"/>
+            </w:tcBorders>
+            <w:tcMar>
+              <w:top w:type="dxa" w:w="55"/>
+              <w:left w:type="dxa" w:w="110"/>
+              <w:bottom w:type="dxa" w:w="55"/>
+              <w:right w:type="dxa" w:w="110"/>
+            </w:tcMar>
+            <w:vAlign w:val="center"/>
+          </w:tcPr>
+          <w:p>
+            <w:pPr>
+              <w:jc w:val="right"/>
+            </w:pPr>
+            <w:r>
+              <w:rPr>
+                <w:sz w:val="18"/>
+                <w:szCs w:val="18"/>
+              </w:rPr>
+              <w:t xml:space="preserve">US$ 2,81</w:t>
+            </w:r>
+          </w:p>
+        </w:tc>
+        <w:tc>
+          <w:tcPr>
+            <w:tcW w:type="dxa" w:w="1980"/>
+            <w:tcBorders>
+              <w:top w:val="single" w:color="DDDDDD" w:sz="1"/>
+              <w:left w:val="single" w:color="DDDDDD" w:sz="1"/>
+              <w:bottom w:val="single" w:color="DDDDDD" w:sz="1"/>
+              <w:right w:val="single" w:color="DDDDDD" w:sz="1"/>
+            </w:tcBorders>
+            <w:tcMar>
+              <w:top w:type="dxa" w:w="55"/>
+              <w:left w:type="dxa" w:w="110"/>
+              <w:bottom w:type="dxa" w:w="55"/>
+              <w:right w:type="dxa" w:w="110"/>
+            </w:tcMar>
+            <w:vAlign w:val="center"/>
+          </w:tcPr>
+          <w:p>
+            <w:pPr>
+              <w:jc w:val="right"/>
+            </w:pPr>
+            <w:r>
+              <w:rPr>
+                <w:b/>
+                <w:bCs/>
+                <w:color w:val="2F8A5F"/>
+                <w:sz w:val="18"/>
+                <w:szCs w:val="18"/>
+              </w:rPr>
+              <w:t xml:space="preserve">-3,1%</w:t>
+            </w:r>
+          </w:p>
+        </w:tc>
+        <w:tc>
+          <w:tcPr>
+            <w:tcW w:type="dxa" w:w="2000"/>
+            <w:tcBorders>
+              <w:top w:val="single" w:color="DDDDDD" w:sz="1"/>
+              <w:left w:val="single" w:color="DDDDDD" w:sz="1"/>
+              <w:bottom w:val="single" w:color="DDDDDD" w:sz="1"/>
+              <w:right w:val="single" w:color="DDDDDD" w:sz="1"/>
+            </w:tcBorders>
+            <w:tcMar>
+              <w:top w:type="dxa" w:w="55"/>
+              <w:left w:type="dxa" w:w="110"/>
+              <w:bottom w:type="dxa" w:w="55"/>
+              <w:right w:type="dxa" w:w="110"/>
+            </w:tcMar>
+            <w:vAlign w:val="center"/>
+          </w:tcPr>
+          <w:p>
+            <w:pPr>
+              <w:jc w:val="left"/>
+            </w:pPr>
+            <w:r>
+              <w:rPr>
+                <w:sz w:val="17"/>
+                <w:szCs w:val="17"/>
+              </w:rPr>
+              <w:t xml:space="preserve">Pressiona ureia</w:t>
+            </w:r>
+          </w:p>
+        </w:tc>
+      </w:tr>
+      <w:tr>
+        <w:tc>
+          <w:tcPr>
+            <w:tcW w:type="dxa" w:w="3400"/>
+            <w:tcBorders>
+              <w:top w:val="single" w:color="DDDDDD" w:sz="1"/>
+              <w:left w:val="single" w:color="DDDDDD" w:sz="1"/>
+              <w:bottom w:val="single" w:color="DDDDDD" w:sz="1"/>
+              <w:right w:val="single" w:color="DDDDDD" w:sz="1"/>
+            </w:tcBorders>
+            <w:tcMar>
+              <w:top w:type="dxa" w:w="55"/>
+              <w:left w:type="dxa" w:w="110"/>
+              <w:bottom w:type="dxa" w:w="55"/>
+              <w:right w:type="dxa" w:w="110"/>
+            </w:tcMar>
+            <w:vAlign w:val="center"/>
+          </w:tcPr>
+          <w:p>
+            <w:pPr>
+              <w:jc w:val="left"/>
+            </w:pPr>
+            <w:r>
+              <w:rPr>
+                <w:sz w:val="18"/>
+                <w:szCs w:val="18"/>
+              </w:rPr>
+              <w:t xml:space="preserve">Frete Marítimo (BDI)</w:t>
+            </w:r>
+          </w:p>
+        </w:tc>
+        <w:tc>
+          <w:tcPr>
+            <w:tcW w:type="dxa" w:w="1980"/>
+            <w:tcBorders>
+              <w:top w:val="single" w:color="DDDDDD" w:sz="1"/>
+              <w:left w:val="single" w:color="DDDDDD" w:sz="1"/>
+              <w:bottom w:val="single" w:color="DDDDDD" w:sz="1"/>
+              <w:right w:val="single" w:color="DDDDDD" w:sz="1"/>
+            </w:tcBorders>
+            <w:tcMar>
+              <w:top w:type="dxa" w:w="55"/>
+              <w:left w:type="dxa" w:w="110"/>
+              <w:bottom w:type="dxa" w:w="55"/>
+              <w:right w:type="dxa" w:w="110"/>
+            </w:tcMar>
+            <w:vAlign w:val="center"/>
+          </w:tcPr>
+          <w:p>
+            <w:pPr>
+              <w:jc w:val="right"/>
+            </w:pPr>
+            <w:r>
+              <w:rPr>
+                <w:sz w:val="18"/>
+                <w:szCs w:val="18"/>
+              </w:rPr>
+              <w:t xml:space="preserve">3.507 pts</w:t>
+            </w:r>
+          </w:p>
+        </w:tc>
+        <w:tc>
+          <w:tcPr>
+            <w:tcW w:type="dxa" w:w="1980"/>
+            <w:tcBorders>
+              <w:top w:val="single" w:color="DDDDDD" w:sz="1"/>
+              <w:left w:val="single" w:color="DDDDDD" w:sz="1"/>
+              <w:bottom w:val="single" w:color="DDDDDD" w:sz="1"/>
+              <w:right w:val="single" w:color="DDDDDD" w:sz="1"/>
+            </w:tcBorders>
+            <w:tcMar>
+              <w:top w:type="dxa" w:w="55"/>
+              <w:left w:type="dxa" w:w="110"/>
+              <w:bottom w:type="dxa" w:w="55"/>
+              <w:right w:type="dxa" w:w="110"/>
+            </w:tcMar>
+            <w:vAlign w:val="center"/>
+          </w:tcPr>
+          <w:p>
+            <w:pPr>
+              <w:jc w:val="right"/>
+            </w:pPr>
+            <w:r>
+              <w:rPr>
+                <w:b/>
+                <w:bCs/>
+                <w:color w:val="2F8A5F"/>
+                <w:sz w:val="18"/>
+                <w:szCs w:val="18"/>
+              </w:rPr>
+              <w:t xml:space="preserve">-1,9%</w:t>
             </w:r>
           </w:p>
         </w:tc>
@@ -2006,90 +2006,14 @@
           <w:sz w:val="18"/>
           <w:szCs w:val="18"/>
         </w:rPr>
-        <w:t xml:space="preserve">BDI: </w:t>
+        <w:t xml:space="preserve">Gás Natural: </w:t>
       </w:r>
       <w:r>
         <w:rPr>
           <w:sz w:val="18"/>
           <w:szCs w:val="18"/>
         </w:rPr>
-        <w:t xml:space="preserve">queda de -1,5% no período.</w:t>
-      </w:r>
-    </w:p>
-    <w:p>
-      <w:pPr>
-        <w:pBdr>
-          <w:bottom w:val="single" w:color="1E2A44" w:sz="6" w:space="2"/>
-        </w:pBdr>
-        <w:spacing w:after="100" w:before="220"/>
-      </w:pPr>
-      <w:r>
-        <w:rPr>
-          <w:b/>
-          <w:bCs/>
-          <w:color w:val="1E2A44"/>
-          <w:sz w:val="22"/>
-          <w:szCs w:val="22"/>
-        </w:rPr>
-        <w:t xml:space="preserve">6. Contexto de Mercado — Causas da Alta e Perspectivas</w:t>
-      </w:r>
-    </w:p>
-    <w:p>
-      <w:pPr>
-        <w:spacing w:after="60"/>
-      </w:pPr>
-      <w:r>
-        <w:rPr>
-          <w:b/>
-          <w:bCs/>
-          <w:color w:val="1E2A44"/>
-          <w:sz w:val="18"/>
-          <w:szCs w:val="18"/>
-        </w:rPr>
-        <w:t xml:space="preserve">Por que os fertilizantes subiram — e o que esperar · atualizado em Setembro/2026 · revisão manual.</w:t>
-      </w:r>
-    </w:p>
-    <w:p>
-      <w:pPr>
-        <w:spacing w:after="60"/>
-        <w:jc w:val="both"/>
-      </w:pPr>
-      <w:r>
-        <w:rPr>
-          <w:sz w:val="18"/>
-          <w:szCs w:val="18"/>
-        </w:rPr>
-        <w:t xml:space="preserve">Em setembro o quadro é de alívio parcial, não de normalização: os preços recuaram dos picos e a China voltou a exportar, mas a oferta segue apertada — sobretudo nos fosfatados (MAP) — e o abastecimento da safra 2026/27 virou a principal preocupação, com importações atrasadas e o governo atuando na logística dos portos.</w:t>
-      </w:r>
-    </w:p>
-    <w:p>
-      <w:pPr>
-        <w:spacing w:after="80"/>
-      </w:pPr>
-      <w:r>
-        <w:rPr>
-          <w:i/>
-          <w:iCs/>
-          <w:color w:val="6B7585"/>
-          <w:sz w:val="17"/>
-          <w:szCs w:val="17"/>
-        </w:rPr>
-        <w:t xml:space="preserve">Leitura automática: sem novo fechamento de fertilizantes desde a leitura anterior (ago/26).</w:t>
-      </w:r>
-    </w:p>
-    <w:p>
-      <w:pPr>
-        <w:spacing w:after="40"/>
-      </w:pPr>
-      <w:r>
-        <w:rPr>
-          <w:b/>
-          <w:bCs/>
-          <w:color w:val="1E2A44"/>
-          <w:sz w:val="18"/>
-          <w:szCs w:val="18"/>
-        </w:rPr>
-        <w:t xml:space="preserve">Principais causas da alta:</w:t>
+        <w:t xml:space="preserve">queda de -3,1% no período.</w:t>
       </w:r>
     </w:p>
     <w:p>
@@ -2105,17 +2029,17 @@
         <w:rPr>
           <w:b/>
           <w:bCs/>
-          <w:sz w:val="17"/>
-          <w:szCs w:val="17"/>
-        </w:rPr>
-        <w:t xml:space="preserve">Fosfatados (MAP) ainda pressionados: </w:t>
-      </w:r>
-      <w:r>
-        <w:rPr>
-          <w:sz w:val="17"/>
-          <w:szCs w:val="17"/>
-        </w:rPr>
-        <w:t xml:space="preserve">É o segmento mais crítico. As importações brasileiras de MAP caíram cerca de 24% no 1º semestre; a oferta chinesa, mesmo com retomada parcial, ainda é limitada, e a escassez de enxofre (matéria-prima do MAP) mantém o custo alto.</w:t>
+          <w:sz w:val="18"/>
+          <w:szCs w:val="18"/>
+        </w:rPr>
+        <w:t xml:space="preserve">BDI: </w:t>
+      </w:r>
+      <w:r>
+        <w:rPr>
+          <w:sz w:val="18"/>
+          <w:szCs w:val="18"/>
+        </w:rPr>
+        <w:t xml:space="preserve">queda de -1,9% no período.</w:t>
       </w:r>
     </w:p>
     <w:p>
@@ -2131,17 +2055,93 @@
         <w:rPr>
           <w:b/>
           <w:bCs/>
+          <w:sz w:val="18"/>
+          <w:szCs w:val="18"/>
+        </w:rPr>
+        <w:t xml:space="preserve">Dólar: </w:t>
+      </w:r>
+      <w:r>
+        <w:rPr>
+          <w:sz w:val="18"/>
+          <w:szCs w:val="18"/>
+        </w:rPr>
+        <w:t xml:space="preserve">queda de -0,8% no período.</w:t>
+      </w:r>
+    </w:p>
+    <w:p>
+      <w:pPr>
+        <w:pBdr>
+          <w:bottom w:val="single" w:color="1E2A44" w:sz="6" w:space="2"/>
+        </w:pBdr>
+        <w:spacing w:after="100" w:before="220"/>
+      </w:pPr>
+      <w:r>
+        <w:rPr>
+          <w:b/>
+          <w:bCs/>
+          <w:color w:val="1E2A44"/>
+          <w:sz w:val="22"/>
+          <w:szCs w:val="22"/>
+        </w:rPr>
+        <w:t xml:space="preserve">6. Contexto de Mercado — Causas da Alta e Perspectivas</w:t>
+      </w:r>
+    </w:p>
+    <w:p>
+      <w:pPr>
+        <w:spacing w:after="60"/>
+      </w:pPr>
+      <w:r>
+        <w:rPr>
+          <w:b/>
+          <w:bCs/>
+          <w:color w:val="1E2A44"/>
+          <w:sz w:val="18"/>
+          <w:szCs w:val="18"/>
+        </w:rPr>
+        <w:t xml:space="preserve">Por que os fertilizantes subiram — e o que esperar · atualizado em Setembro/2026 · revisão manual.</w:t>
+      </w:r>
+    </w:p>
+    <w:p>
+      <w:pPr>
+        <w:spacing w:after="60"/>
+        <w:jc w:val="both"/>
+      </w:pPr>
+      <w:r>
+        <w:rPr>
+          <w:sz w:val="18"/>
+          <w:szCs w:val="18"/>
+        </w:rPr>
+        <w:t xml:space="preserve">Em setembro o quadro é de alívio parcial, não de normalização: os preços recuaram dos picos e a China voltou a exportar, mas a oferta segue apertada — sobretudo nos fosfatados (MAP) — e o abastecimento da safra 2026/27 virou a principal preocupação, com importações atrasadas e o governo atuando na logística dos portos.</w:t>
+      </w:r>
+    </w:p>
+    <w:p>
+      <w:pPr>
+        <w:spacing w:after="80"/>
+      </w:pPr>
+      <w:r>
+        <w:rPr>
+          <w:i/>
+          <w:iCs/>
+          <w:color w:val="6B7585"/>
           <w:sz w:val="17"/>
           <w:szCs w:val="17"/>
         </w:rPr>
-        <w:t xml:space="preserve">Escassez de enxofre: </w:t>
-      </w:r>
-      <w:r>
-        <w:rPr>
-          <w:sz w:val="17"/>
-          <w:szCs w:val="17"/>
-        </w:rPr>
-        <w:t xml:space="preserve">Insumo essencial dos fosfatados, o enxofre saltou de cerca de US$ 100/t no pré-guerra para a faixa de US$ 1.200/t, levando fábricas a reduzir produção e apertando ainda mais a oferta de MAP.</w:t>
+        <w:t xml:space="preserve">Leitura automática: sem novo fechamento de fertilizantes desde a leitura anterior (ago/26).</w:t>
+      </w:r>
+    </w:p>
+    <w:p>
+      <w:pPr>
+        <w:spacing w:after="40"/>
+      </w:pPr>
+      <w:r>
+        <w:rPr>
+          <w:b/>
+          <w:bCs/>
+          <w:color w:val="1E2A44"/>
+          <w:sz w:val="18"/>
+          <w:szCs w:val="18"/>
+        </w:rPr>
+        <w:t xml:space="preserve">Principais causas da alta:</w:t>
       </w:r>
     </w:p>
     <w:p>
@@ -2160,14 +2160,14 @@
           <w:sz w:val="17"/>
           <w:szCs w:val="17"/>
         </w:rPr>
-        <w:t xml:space="preserve">China retomou exportações (alívio parcial): </w:t>
+        <w:t xml:space="preserve">Fosfatados (MAP) ainda pressionados: </w:t>
       </w:r>
       <w:r>
         <w:rPr>
           <w:sz w:val="17"/>
           <w:szCs w:val="17"/>
         </w:rPr>
-        <w:t xml:space="preserve">A volta gradual dos embarques chineses trouxe algum alívio a nitrogenados e fosfatados, mas ainda não elimina o risco de desabastecimento para a safra 2026/27.</w:t>
+        <w:t xml:space="preserve">É o segmento mais crítico. As importações brasileiras de MAP caíram cerca de 24% no 1º semestre; a oferta chinesa, mesmo com retomada parcial, ainda é limitada, e a escassez de enxofre (matéria-prima do MAP) mantém o custo alto.</w:t>
       </w:r>
     </w:p>
     <w:p>
@@ -2186,14 +2186,14 @@
           <w:sz w:val="17"/>
           <w:szCs w:val="17"/>
         </w:rPr>
-        <w:t xml:space="preserve">Importações atrasadas e cautelosas: </w:t>
+        <w:t xml:space="preserve">Escassez de enxofre: </w:t>
       </w:r>
       <w:r>
         <w:rPr>
           <w:sz w:val="17"/>
           <w:szCs w:val="17"/>
         </w:rPr>
-        <w:t xml:space="preserve">No 1º semestre os desembarques totais caíram ~8,6% (ureia −32%, MAP −24%), com compradores adiando negócios diante da volatilidade e da relação de troca ruim. O tempo para garantir o abastecimento do plantio (set–out) ficou curto.</w:t>
+        <w:t xml:space="preserve">Insumo essencial dos fosfatados, o enxofre saltou de cerca de US$ 100/t no pré-guerra para a faixa de US$ 1.200/t, levando fábricas a reduzir produção e apertando ainda mais a oferta de MAP.</w:t>
       </w:r>
     </w:p>
     <w:p>
@@ -2212,42 +2212,14 @@
           <w:sz w:val="17"/>
           <w:szCs w:val="17"/>
         </w:rPr>
-        <w:t xml:space="preserve">Oriente Médio e logística: </w:t>
+        <w:t xml:space="preserve">China retomou exportações (alívio parcial): </w:t>
       </w:r>
       <w:r>
         <w:rPr>
           <w:sz w:val="17"/>
           <w:szCs w:val="17"/>
         </w:rPr>
-        <w:t xml:space="preserve">As tensões e a disrupção de rotas ligadas ao Estreito de Ormuz afetaram ureia, amônia, enxofre e fosfatos, e ainda pesam sobre o frete e a previsibilidade das entregas.</w:t>
-      </w:r>
-    </w:p>
-    <w:p>
-      <w:pPr>
-        <w:spacing w:after="80" w:before="40"/>
-        <w:jc w:val="both"/>
-      </w:pPr>
-      <w:r>
-        <w:rPr>
-          <w:sz w:val="17"/>
-          <w:szCs w:val="17"/>
-        </w:rPr>
-        <w:t xml:space="preserve">No 1º semestre de 2026 as importações brasileiras das principais matérias-primas caíram ~8,6%, com ureia −32%, MAP −24% e enxofre −42% (StoneX). A ureia recuou dos picos do meio do ano, mas a relação de troca segue desfavorável — o Brasil importou cerca de 7% menos fertilizante e ainda assim o produtor gastou mais. A RaboResearch reduziu a projeção de entregas no país para ~45,1 milhões de toneladas em 2026, abaixo do recorde de 2025.</w:t>
-      </w:r>
-    </w:p>
-    <w:p>
-      <w:pPr>
-        <w:spacing w:after="40" w:before="40"/>
-      </w:pPr>
-      <w:r>
-        <w:rPr>
-          <w:b/>
-          <w:bCs/>
-          <w:color w:val="1E2A44"/>
-          <w:sz w:val="18"/>
-          <w:szCs w:val="18"/>
-        </w:rPr>
-        <w:t xml:space="preserve">O que esperar nos próximos meses:</w:t>
+        <w:t xml:space="preserve">A volta gradual dos embarques chineses trouxe algum alívio a nitrogenados e fosfatados, mas ainda não elimina o risco de desabastecimento para a safra 2026/27.</w:t>
       </w:r>
     </w:p>
     <w:p>
@@ -2261,10 +2233,19 @@
       </w:pPr>
       <w:r>
         <w:rPr>
+          <w:b/>
+          <w:bCs/>
           <w:sz w:val="17"/>
           <w:szCs w:val="17"/>
         </w:rPr>
-        <w:t xml:space="preserve">Ureia (nitrogenados): preços fora dos extremos e acessibilidade em recuperação desde julho; espera-se retomada gradual das compras até o fim do ano, mas atrasos podem pressionar a 2ª safra de milho (plantio em jan/2027).</w:t>
+        <w:t xml:space="preserve">Importações atrasadas e cautelosas: </w:t>
+      </w:r>
+      <w:r>
+        <w:rPr>
+          <w:sz w:val="17"/>
+          <w:szCs w:val="17"/>
+        </w:rPr>
+        <w:t xml:space="preserve">No 1º semestre os desembarques totais caíram ~8,6% (ureia −32%, MAP −24%), com compradores adiando negócios diante da volatilidade e da relação de troca ruim. O tempo para garantir o abastecimento do plantio (set–out) ficou curto.</w:t>
       </w:r>
     </w:p>
     <w:p>
@@ -2278,10 +2259,47 @@
       </w:pPr>
       <w:r>
         <w:rPr>
+          <w:b/>
+          <w:bCs/>
           <w:sz w:val="17"/>
           <w:szCs w:val="17"/>
         </w:rPr>
-        <w:t xml:space="preserve">MAP (fosfatados): segue o ponto mais delicado; oferta apertada e enxofre caro limitam quedas, com risco de faltar produto no pico de plantio (set–out).</w:t>
+        <w:t xml:space="preserve">Oriente Médio e logística: </w:t>
+      </w:r>
+      <w:r>
+        <w:rPr>
+          <w:sz w:val="17"/>
+          <w:szCs w:val="17"/>
+        </w:rPr>
+        <w:t xml:space="preserve">As tensões e a disrupção de rotas ligadas ao Estreito de Ormuz afetaram ureia, amônia, enxofre e fosfatos, e ainda pesam sobre o frete e a previsibilidade das entregas.</w:t>
+      </w:r>
+    </w:p>
+    <w:p>
+      <w:pPr>
+        <w:spacing w:after="80" w:before="40"/>
+        <w:jc w:val="both"/>
+      </w:pPr>
+      <w:r>
+        <w:rPr>
+          <w:sz w:val="17"/>
+          <w:szCs w:val="17"/>
+        </w:rPr>
+        <w:t xml:space="preserve">No 1º semestre de 2026 as importações brasileiras das principais matérias-primas caíram ~8,6%, com ureia −32%, MAP −24% e enxofre −42% (StoneX). A ureia recuou dos picos do meio do ano, mas a relação de troca segue desfavorável — o Brasil importou cerca de 7% menos fertilizante e ainda assim o produtor gastou mais. A RaboResearch reduziu a projeção de entregas no país para ~45,1 milhões de toneladas em 2026, abaixo do recorde de 2025.</w:t>
+      </w:r>
+    </w:p>
+    <w:p>
+      <w:pPr>
+        <w:spacing w:after="40" w:before="40"/>
+      </w:pPr>
+      <w:r>
+        <w:rPr>
+          <w:b/>
+          <w:bCs/>
+          <w:color w:val="1E2A44"/>
+          <w:sz w:val="18"/>
+          <w:szCs w:val="18"/>
+        </w:rPr>
+        <w:t xml:space="preserve">O que esperar nos próximos meses:</w:t>
       </w:r>
     </w:p>
     <w:p>
@@ -2298,7 +2316,7 @@
           <w:sz w:val="17"/>
           <w:szCs w:val="17"/>
         </w:rPr>
-        <w:t xml:space="preserve">KCl (potássio): segmento mais confortável e com preços entre os mais favoráveis em anos; boa janela de reposição.</w:t>
+        <w:t xml:space="preserve">Ureia (nitrogenados): preços fora dos extremos e acessibilidade em recuperação desde julho; espera-se retomada gradual das compras até o fim do ano, mas atrasos podem pressionar a 2ª safra de milho (plantio em jan/2027).</w:t>
       </w:r>
     </w:p>
     <w:p>
@@ -2315,7 +2333,7 @@
           <w:sz w:val="17"/>
           <w:szCs w:val="17"/>
         </w:rPr>
-        <w:t xml:space="preserve">Ação do governo: a Casa Civil mantém a Sala de Situação sobre Fertilizantes, e foi publicada resolução (ago/2026, validade de 6 meses) priorizando o desembarque de fertilizantes nos portos públicos para garantir o abastecimento da safra 2026/27.</w:t>
+        <w:t xml:space="preserve">MAP (fosfatados): segue o ponto mais delicado; oferta apertada e enxofre caro limitam quedas, com risco de faltar produto no pico de plantio (set–out).</w:t>
       </w:r>
     </w:p>
     <w:p>
@@ -2332,22 +2350,7 @@
           <w:sz w:val="17"/>
           <w:szCs w:val="17"/>
         </w:rPr>
-        <w:t xml:space="preserve">Riscos a monitorar: duração do conflito e normalização do Estreito de Ormuz, ritmo real da oferta chinesa, preço do enxofre, câmbio, crédito rural apertado e clima (risco de El Niño forte).</w:t>
-      </w:r>
-    </w:p>
-    <w:p>
-      <w:pPr>
-        <w:spacing w:after="20" w:before="60"/>
-      </w:pPr>
-      <w:r>
-        <w:rPr>
-          <w:b/>
-          <w:bCs/>
-          <w:color w:val="1E2A44"/>
-          <w:sz w:val="17"/>
-          <w:szCs w:val="17"/>
-        </w:rPr>
-        <w:t xml:space="preserve">Notícias recentes do mercado (atualização automática):</w:t>
+        <w:t xml:space="preserve">KCl (potássio): segmento mais confortável e com preços entre os mais favoráveis em anos; boa janela de reposição.</w:t>
       </w:r>
     </w:p>
     <w:p>
@@ -2361,10 +2364,10 @@
       </w:pPr>
       <w:r>
         <w:rPr>
-          <w:sz w:val="16"/>
-          <w:szCs w:val="16"/>
-        </w:rPr>
-        <w:t xml:space="preserve">Tempo e Clima 04/08/2026 - 12:41 El Niño reforça importância da nutrição das plantas para reduzir perdas no campo</w:t>
+          <w:sz w:val="17"/>
+          <w:szCs w:val="17"/>
+        </w:rPr>
+        <w:t xml:space="preserve">Ação do governo: a Casa Civil mantém a Sala de Situação sobre Fertilizantes, e foi publicada resolução (ago/2026, validade de 6 meses) priorizando o desembarque de fertilizantes nos portos públicos para garantir o abastecimento da safra 2026/27.</w:t>
       </w:r>
     </w:p>
     <w:p>
@@ -2378,10 +2381,25 @@
       </w:pPr>
       <w:r>
         <w:rPr>
-          <w:sz w:val="16"/>
-          <w:szCs w:val="16"/>
-        </w:rPr>
-        <w:t xml:space="preserve">Agronegócio 30/06/2026 - 09:30 Mercado de fertilizantes amplia movimento de baixa com recuo da ureia, MAP e cloreto de potássio</w:t>
+          <w:sz w:val="17"/>
+          <w:szCs w:val="17"/>
+        </w:rPr>
+        <w:t xml:space="preserve">Riscos a monitorar: duração do conflito e normalização do Estreito de Ormuz, ritmo real da oferta chinesa, preço do enxofre, câmbio, crédito rural apertado e clima (risco de El Niño forte).</w:t>
+      </w:r>
+    </w:p>
+    <w:p>
+      <w:pPr>
+        <w:spacing w:after="20" w:before="60"/>
+      </w:pPr>
+      <w:r>
+        <w:rPr>
+          <w:b/>
+          <w:bCs/>
+          <w:color w:val="1E2A44"/>
+          <w:sz w:val="17"/>
+          <w:szCs w:val="17"/>
+        </w:rPr>
+        <w:t xml:space="preserve">Notícias recentes do mercado (atualização automática):</w:t>
       </w:r>
     </w:p>
     <w:p>
@@ -2398,7 +2416,7 @@
           <w:sz w:val="16"/>
           <w:szCs w:val="16"/>
         </w:rPr>
-        <w:t xml:space="preserve">Agronegócio 19/06/2026 - 11:01 Importação dos EUA de fertilizante com origem no Oriente Médio zera em maio</w:t>
+        <w:t xml:space="preserve">Tempo e Clima 04/08/2026 - 12:41 El Niño reforça importância da nutrição das plantas para reduzir perdas no campo</w:t>
       </w:r>
     </w:p>
     <w:p>
@@ -2415,6 +2433,40 @@
           <w:sz w:val="16"/>
           <w:szCs w:val="16"/>
         </w:rPr>
+        <w:t xml:space="preserve">Agronegócio 30/06/2026 - 09:30 Mercado de fertilizantes amplia movimento de baixa com recuo da ureia, MAP e cloreto de potássio</w:t>
+      </w:r>
+    </w:p>
+    <w:p>
+      <w:pPr>
+        <w:pStyle w:val="ListParagraph"/>
+        <w:numPr>
+          <w:ilvl w:val="0"/>
+          <w:numId w:val="2"/>
+        </w:numPr>
+        <w:spacing w:after="70"/>
+      </w:pPr>
+      <w:r>
+        <w:rPr>
+          <w:sz w:val="16"/>
+          <w:szCs w:val="16"/>
+        </w:rPr>
+        <w:t xml:space="preserve">Agronegócio 19/06/2026 - 11:01 Importação dos EUA de fertilizante com origem no Oriente Médio zera em maio</w:t>
+      </w:r>
+    </w:p>
+    <w:p>
+      <w:pPr>
+        <w:pStyle w:val="ListParagraph"/>
+        <w:numPr>
+          <w:ilvl w:val="0"/>
+          <w:numId w:val="2"/>
+        </w:numPr>
+        <w:spacing w:after="70"/>
+      </w:pPr>
+      <w:r>
+        <w:rPr>
+          <w:sz w:val="16"/>
+          <w:szCs w:val="16"/>
+        </w:rPr>
         <w:t xml:space="preserve">Agronegócio 16/06/2026 - 16:30 Ureia cai mais de 40% e volta ao nível pré-crise com avanço de acordo entre EUA e Irã</w:t>
       </w:r>
     </w:p>
@@ -2504,7 +2556,7 @@
           <w:sz w:val="15"/>
           <w:szCs w:val="15"/>
         </w:rPr>
-        <w:t xml:space="preserve">Fontes automáticas: AwesomeAPI (câmbio), CEPEA/ESALQ (soja), ANP (diesel), stooq (BDI). Fertilizantes e gás natural: override manual (fertilizers-override.json). Status desta execução: {"bdi":"ok (HANDYBULK, 07/09/2026)","soja":"ok (Noticias Agricolas / CEPEA-PR 04/09/2026)","sojaRegional":"ok (Oeste da Bahia/BA (AIBA))","cambio":"ok (BCB PTAX)","diesel":"falha: Petrobras: HTTP 403 | PortalCanaa: HTTP 403","_comexPeriodo":"com-filtro-ncm | 2026-08 | 4 linhas","_comexNcmsEncontrados":"31042090,31021010,31054000,31042010","ureia":"ok (ComexStat 2026-08)","map":"ok (ComexStat 2026-08)","kcl":"ok (ComexStat 2026-08)","gas":"ok (EIA Henry Hub)","noticias":"ok (40 de https://www.noticiasagricolas.com.br/tags/fertilizantes/)"}.</w:t>
+        <w:t xml:space="preserve">Fontes automáticas: AwesomeAPI (câmbio), CEPEA/ESALQ (soja), ANP (diesel), stooq (BDI). Fertilizantes e gás natural: override manual (fertilizers-override.json). Status desta execução: {"sojaRegional":"ok (Oeste da Bahia/BA (AIBA))","bdi":"ok (HANDYBULK, 11/09/2026)","soja":"ok (Noticias Agricolas / CEPEA-PR 11/09/2026)","cambio":"ok (BCB PTAX)","diesel":"falha: Petrobras: HTTP 403 | PortalCanaa: HTTP 403","_comexRetry":"aguardando 15s apos 429 (com-filtro-ncm 2026-08, tentativa 2)","_comexPeriodo":"com-filtro-ncm | 2026-08 | 4 linhas","_comexNcmsEncontrados":"31042090,31021010,31054000,31042010","ureia":"ok (ComexStat 2026-08)","map":"ok (ComexStat 2026-08)","kcl":"ok (ComexStat 2026-08)","gas":"ok (EIA Henry Hub)","noticias":"ok (40 de https://www.noticiasagricolas.com.br/tags/fertilizantes/)"}.</w:t>
       </w:r>
     </w:p>
     <w:p>

</xml_diff>

<commit_message>
chore: atualizacao automatica 2026-09-15
</commit_message>
<xml_diff>
--- a/relatorio_executivo.docx
+++ b/relatorio_executivo.docx
@@ -46,7 +46,7 @@
           <w:sz w:val="17"/>
           <w:szCs w:val="17"/>
         </w:rPr>
-        <w:t xml:space="preserve">Equipe de Planejamento, Controle e Pesquisa Florestal  ·  Referência: Set/2026  ·  Gerado em 14/09/2026, 16:07:22</w:t>
+        <w:t xml:space="preserve">Equipe de Planejamento, Controle e Pesquisa Florestal  ·  Referência: Set/2026  ·  Gerado em 15/09/2026, 10:52:38</w:t>
       </w:r>
     </w:p>
     <w:p>
@@ -84,21 +84,21 @@
           <w:sz w:val="19"/>
           <w:szCs w:val="19"/>
         </w:rPr>
-        <w:t xml:space="preserve">Ureia FOB em US$ 413/t (fechamento ago/26), MAP US$ 834/t e KCl US$ 352/t. </w:t>
+        <w:t xml:space="preserve">Ureia FOB em US$ 491/t (+18,9%), MAP US$ 640/t e KCl US$ 328/t. </w:t>
       </w:r>
       <w:r>
         <w:rPr>
           <w:sz w:val="19"/>
           <w:szCs w:val="19"/>
         </w:rPr>
-        <w:t xml:space="preserve">O dólar está em R$ 5,09 (-0,8%) e a soja CEPEA em R$ 152,82/saca. </w:t>
+        <w:t xml:space="preserve">O dólar está em R$ 5,17 (+1,6%) e a soja CEPEA em R$ 152,90/saca. </w:t>
       </w:r>
       <w:r>
         <w:rPr>
           <w:sz w:val="19"/>
           <w:szCs w:val="19"/>
         </w:rPr>
-        <w:t xml:space="preserve">A relação de troca soja/MAP é de 28,6 sacas/t.</w:t>
+        <w:t xml:space="preserve">A relação de troca soja/MAP é de 22,4 sacas/t.</w:t>
       </w:r>
     </w:p>
     <w:p>
@@ -323,7 +323,7 @@
                 <w:sz w:val="18"/>
                 <w:szCs w:val="18"/>
               </w:rPr>
-              <w:t xml:space="preserve">US$ 413/t</w:t>
+              <w:t xml:space="preserve">US$ 491/t</w:t>
             </w:r>
           </w:p>
         </w:tc>
@@ -352,11 +352,11 @@
               <w:rPr>
                 <w:b/>
                 <w:bCs/>
-                <w:color w:val="6B7585"/>
+                <w:color w:val="B23636"/>
                 <w:sz w:val="18"/>
                 <w:szCs w:val="18"/>
               </w:rPr>
-              <w:t xml:space="preserve">—</w:t>
+              <w:t xml:space="preserve">+18,9%</w:t>
             </w:r>
           </w:p>
         </w:tc>
@@ -386,7 +386,7 @@
                 <w:sz w:val="17"/>
                 <w:szCs w:val="17"/>
               </w:rPr>
-              <w:t xml:space="preserve">Fechamento ago/26 (sem novo dado)</w:t>
+              <w:t xml:space="preserve">Nitrogenado · ref. ago/26</w:t>
             </w:r>
           </w:p>
         </w:tc>
@@ -448,7 +448,7 @@
                 <w:sz w:val="18"/>
                 <w:szCs w:val="18"/>
               </w:rPr>
-              <w:t xml:space="preserve">US$ 834/t</w:t>
+              <w:t xml:space="preserve">US$ 640/t</w:t>
             </w:r>
           </w:p>
         </w:tc>
@@ -477,11 +477,11 @@
               <w:rPr>
                 <w:b/>
                 <w:bCs/>
-                <w:color w:val="6B7585"/>
+                <w:color w:val="2F8A5F"/>
                 <w:sz w:val="18"/>
                 <w:szCs w:val="18"/>
               </w:rPr>
-              <w:t xml:space="preserve">—</w:t>
+              <w:t xml:space="preserve">-23,3%</w:t>
             </w:r>
           </w:p>
         </w:tc>
@@ -511,7 +511,7 @@
                 <w:sz w:val="17"/>
                 <w:szCs w:val="17"/>
               </w:rPr>
-              <w:t xml:space="preserve">Fechamento ago/26 (sem novo dado)</w:t>
+              <w:t xml:space="preserve">Fosfatado · ref. ago/26</w:t>
             </w:r>
           </w:p>
         </w:tc>
@@ -573,7 +573,7 @@
                 <w:sz w:val="18"/>
                 <w:szCs w:val="18"/>
               </w:rPr>
-              <w:t xml:space="preserve">US$ 352/t</w:t>
+              <w:t xml:space="preserve">US$ 328/t</w:t>
             </w:r>
           </w:p>
         </w:tc>
@@ -602,11 +602,11 @@
               <w:rPr>
                 <w:b/>
                 <w:bCs/>
-                <w:color w:val="6B7585"/>
+                <w:color w:val="2F8A5F"/>
                 <w:sz w:val="18"/>
                 <w:szCs w:val="18"/>
               </w:rPr>
-              <w:t xml:space="preserve">—</w:t>
+              <w:t xml:space="preserve">-6,8%</w:t>
             </w:r>
           </w:p>
         </w:tc>
@@ -636,7 +636,7 @@
                 <w:sz w:val="17"/>
                 <w:szCs w:val="17"/>
               </w:rPr>
-              <w:t xml:space="preserve">Fechamento ago/26 (sem novo dado)</w:t>
+              <w:t xml:space="preserve">Potássico · ref. ago/26</w:t>
             </w:r>
           </w:p>
         </w:tc>
@@ -864,7 +864,257 @@
                 <w:sz w:val="18"/>
                 <w:szCs w:val="18"/>
               </w:rPr>
-              <w:t xml:space="preserve">R$ 152,82/sc</w:t>
+              <w:t xml:space="preserve">R$ 152,90/sc</w:t>
+            </w:r>
+          </w:p>
+        </w:tc>
+        <w:tc>
+          <w:tcPr>
+            <w:tcW w:type="dxa" w:w="1980"/>
+            <w:tcBorders>
+              <w:top w:val="single" w:color="DDDDDD" w:sz="1"/>
+              <w:left w:val="single" w:color="DDDDDD" w:sz="1"/>
+              <w:bottom w:val="single" w:color="DDDDDD" w:sz="1"/>
+              <w:right w:val="single" w:color="DDDDDD" w:sz="1"/>
+            </w:tcBorders>
+            <w:tcMar>
+              <w:top w:type="dxa" w:w="55"/>
+              <w:left w:type="dxa" w:w="110"/>
+              <w:bottom w:type="dxa" w:w="55"/>
+              <w:right w:type="dxa" w:w="110"/>
+            </w:tcMar>
+            <w:vAlign w:val="center"/>
+          </w:tcPr>
+          <w:p>
+            <w:pPr>
+              <w:jc w:val="right"/>
+            </w:pPr>
+            <w:r>
+              <w:rPr>
+                <w:b/>
+                <w:bCs/>
+                <w:color w:val="6B7585"/>
+                <w:sz w:val="18"/>
+                <w:szCs w:val="18"/>
+              </w:rPr>
+              <w:t xml:space="preserve">+0,1%</w:t>
+            </w:r>
+          </w:p>
+        </w:tc>
+        <w:tc>
+          <w:tcPr>
+            <w:tcW w:type="dxa" w:w="2000"/>
+            <w:tcBorders>
+              <w:top w:val="single" w:color="DDDDDD" w:sz="1"/>
+              <w:left w:val="single" w:color="DDDDDD" w:sz="1"/>
+              <w:bottom w:val="single" w:color="DDDDDD" w:sz="1"/>
+              <w:right w:val="single" w:color="DDDDDD" w:sz="1"/>
+            </w:tcBorders>
+            <w:tcMar>
+              <w:top w:type="dxa" w:w="55"/>
+              <w:left w:type="dxa" w:w="110"/>
+              <w:bottom w:type="dxa" w:w="55"/>
+              <w:right w:type="dxa" w:w="110"/>
+            </w:tcMar>
+            <w:vAlign w:val="center"/>
+          </w:tcPr>
+          <w:p>
+            <w:pPr>
+              <w:jc w:val="left"/>
+            </w:pPr>
+            <w:r>
+              <w:rPr>
+                <w:sz w:val="17"/>
+                <w:szCs w:val="17"/>
+              </w:rPr>
+              <w:t xml:space="preserve">—</w:t>
+            </w:r>
+          </w:p>
+        </w:tc>
+      </w:tr>
+      <w:tr>
+        <w:tc>
+          <w:tcPr>
+            <w:tcW w:type="dxa" w:w="3400"/>
+            <w:tcBorders>
+              <w:top w:val="single" w:color="DDDDDD" w:sz="1"/>
+              <w:left w:val="single" w:color="DDDDDD" w:sz="1"/>
+              <w:bottom w:val="single" w:color="DDDDDD" w:sz="1"/>
+              <w:right w:val="single" w:color="DDDDDD" w:sz="1"/>
+            </w:tcBorders>
+            <w:tcMar>
+              <w:top w:type="dxa" w:w="55"/>
+              <w:left w:type="dxa" w:w="110"/>
+              <w:bottom w:type="dxa" w:w="55"/>
+              <w:right w:type="dxa" w:w="110"/>
+            </w:tcMar>
+            <w:vAlign w:val="center"/>
+          </w:tcPr>
+          <w:p>
+            <w:pPr>
+              <w:jc w:val="left"/>
+            </w:pPr>
+            <w:r>
+              <w:rPr>
+                <w:sz w:val="18"/>
+                <w:szCs w:val="18"/>
+              </w:rPr>
+              <w:t xml:space="preserve">Soja Tocantins (Agrolink)</w:t>
+            </w:r>
+          </w:p>
+        </w:tc>
+        <w:tc>
+          <w:tcPr>
+            <w:tcW w:type="dxa" w:w="1980"/>
+            <w:tcBorders>
+              <w:top w:val="single" w:color="DDDDDD" w:sz="1"/>
+              <w:left w:val="single" w:color="DDDDDD" w:sz="1"/>
+              <w:bottom w:val="single" w:color="DDDDDD" w:sz="1"/>
+              <w:right w:val="single" w:color="DDDDDD" w:sz="1"/>
+            </w:tcBorders>
+            <w:tcMar>
+              <w:top w:type="dxa" w:w="55"/>
+              <w:left w:type="dxa" w:w="110"/>
+              <w:bottom w:type="dxa" w:w="55"/>
+              <w:right w:type="dxa" w:w="110"/>
+            </w:tcMar>
+            <w:vAlign w:val="center"/>
+          </w:tcPr>
+          <w:p>
+            <w:pPr>
+              <w:jc w:val="right"/>
+            </w:pPr>
+            <w:r>
+              <w:rPr>
+                <w:sz w:val="18"/>
+                <w:szCs w:val="18"/>
+              </w:rPr>
+              <w:t xml:space="preserve">R$ 146,00/sc</w:t>
+            </w:r>
+          </w:p>
+        </w:tc>
+        <w:tc>
+          <w:tcPr>
+            <w:tcW w:type="dxa" w:w="1980"/>
+            <w:tcBorders>
+              <w:top w:val="single" w:color="DDDDDD" w:sz="1"/>
+              <w:left w:val="single" w:color="DDDDDD" w:sz="1"/>
+              <w:bottom w:val="single" w:color="DDDDDD" w:sz="1"/>
+              <w:right w:val="single" w:color="DDDDDD" w:sz="1"/>
+            </w:tcBorders>
+            <w:tcMar>
+              <w:top w:type="dxa" w:w="55"/>
+              <w:left w:type="dxa" w:w="110"/>
+              <w:bottom w:type="dxa" w:w="55"/>
+              <w:right w:type="dxa" w:w="110"/>
+            </w:tcMar>
+            <w:vAlign w:val="center"/>
+          </w:tcPr>
+          <w:p>
+            <w:pPr>
+              <w:jc w:val="right"/>
+            </w:pPr>
+            <w:r>
+              <w:rPr>
+                <w:b/>
+                <w:bCs/>
+                <w:color w:val="B23636"/>
+                <w:sz w:val="18"/>
+                <w:szCs w:val="18"/>
+              </w:rPr>
+              <w:t xml:space="preserve">-2,0%</w:t>
+            </w:r>
+          </w:p>
+        </w:tc>
+        <w:tc>
+          <w:tcPr>
+            <w:tcW w:type="dxa" w:w="2000"/>
+            <w:tcBorders>
+              <w:top w:val="single" w:color="DDDDDD" w:sz="1"/>
+              <w:left w:val="single" w:color="DDDDDD" w:sz="1"/>
+              <w:bottom w:val="single" w:color="DDDDDD" w:sz="1"/>
+              <w:right w:val="single" w:color="DDDDDD" w:sz="1"/>
+            </w:tcBorders>
+            <w:tcMar>
+              <w:top w:type="dxa" w:w="55"/>
+              <w:left w:type="dxa" w:w="110"/>
+              <w:bottom w:type="dxa" w:w="55"/>
+              <w:right w:type="dxa" w:w="110"/>
+            </w:tcMar>
+            <w:vAlign w:val="center"/>
+          </w:tcPr>
+          <w:p>
+            <w:pPr>
+              <w:jc w:val="left"/>
+            </w:pPr>
+            <w:r>
+              <w:rPr>
+                <w:sz w:val="17"/>
+                <w:szCs w:val="17"/>
+              </w:rPr>
+              <w:t xml:space="preserve">Spread regional</w:t>
+            </w:r>
+          </w:p>
+        </w:tc>
+      </w:tr>
+      <w:tr>
+        <w:tc>
+          <w:tcPr>
+            <w:tcW w:type="dxa" w:w="3400"/>
+            <w:tcBorders>
+              <w:top w:val="single" w:color="DDDDDD" w:sz="1"/>
+              <w:left w:val="single" w:color="DDDDDD" w:sz="1"/>
+              <w:bottom w:val="single" w:color="DDDDDD" w:sz="1"/>
+              <w:right w:val="single" w:color="DDDDDD" w:sz="1"/>
+            </w:tcBorders>
+            <w:tcMar>
+              <w:top w:type="dxa" w:w="55"/>
+              <w:left w:type="dxa" w:w="110"/>
+              <w:bottom w:type="dxa" w:w="55"/>
+              <w:right w:type="dxa" w:w="110"/>
+            </w:tcMar>
+            <w:vAlign w:val="center"/>
+          </w:tcPr>
+          <w:p>
+            <w:pPr>
+              <w:jc w:val="left"/>
+            </w:pPr>
+            <w:r>
+              <w:rPr>
+                <w:sz w:val="18"/>
+                <w:szCs w:val="18"/>
+              </w:rPr>
+              <w:t xml:space="preserve">Troca Soja/MAP</w:t>
+            </w:r>
+          </w:p>
+        </w:tc>
+        <w:tc>
+          <w:tcPr>
+            <w:tcW w:type="dxa" w:w="1980"/>
+            <w:tcBorders>
+              <w:top w:val="single" w:color="DDDDDD" w:sz="1"/>
+              <w:left w:val="single" w:color="DDDDDD" w:sz="1"/>
+              <w:bottom w:val="single" w:color="DDDDDD" w:sz="1"/>
+              <w:right w:val="single" w:color="DDDDDD" w:sz="1"/>
+            </w:tcBorders>
+            <w:tcMar>
+              <w:top w:type="dxa" w:w="55"/>
+              <w:left w:type="dxa" w:w="110"/>
+              <w:bottom w:type="dxa" w:w="55"/>
+              <w:right w:type="dxa" w:w="110"/>
+            </w:tcMar>
+            <w:vAlign w:val="center"/>
+          </w:tcPr>
+          <w:p>
+            <w:pPr>
+              <w:jc w:val="right"/>
+            </w:pPr>
+            <w:r>
+              <w:rPr>
+                <w:sz w:val="18"/>
+                <w:szCs w:val="18"/>
+              </w:rPr>
+              <w:t xml:space="preserve">22,4 sc/t</w:t>
             </w:r>
           </w:p>
         </w:tc>
@@ -897,7 +1147,7 @@
                 <w:sz w:val="18"/>
                 <w:szCs w:val="18"/>
               </w:rPr>
-              <w:t xml:space="preserve">+0,5%</w:t>
+              <w:t xml:space="preserve">-21,7%</w:t>
             </w:r>
           </w:p>
         </w:tc>
@@ -927,7 +1177,7 @@
                 <w:sz w:val="17"/>
                 <w:szCs w:val="17"/>
               </w:rPr>
-              <w:t xml:space="preserve">—</w:t>
+              <w:t xml:space="preserve">Melhora</w:t>
             </w:r>
           </w:p>
         </w:tc>
@@ -959,7 +1209,7 @@
                 <w:sz w:val="18"/>
                 <w:szCs w:val="18"/>
               </w:rPr>
-              <w:t xml:space="preserve">Soja Tocantins (Agrolink)</w:t>
+              <w:t xml:space="preserve">Troca Soja/Ureia</w:t>
             </w:r>
           </w:p>
         </w:tc>
@@ -989,257 +1239,7 @@
                 <w:sz w:val="18"/>
                 <w:szCs w:val="18"/>
               </w:rPr>
-              <w:t xml:space="preserve">R$ 149,00/sc</w:t>
-            </w:r>
-          </w:p>
-        </w:tc>
-        <w:tc>
-          <w:tcPr>
-            <w:tcW w:type="dxa" w:w="1980"/>
-            <w:tcBorders>
-              <w:top w:val="single" w:color="DDDDDD" w:sz="1"/>
-              <w:left w:val="single" w:color="DDDDDD" w:sz="1"/>
-              <w:bottom w:val="single" w:color="DDDDDD" w:sz="1"/>
-              <w:right w:val="single" w:color="DDDDDD" w:sz="1"/>
-            </w:tcBorders>
-            <w:tcMar>
-              <w:top w:type="dxa" w:w="55"/>
-              <w:left w:type="dxa" w:w="110"/>
-              <w:bottom w:type="dxa" w:w="55"/>
-              <w:right w:type="dxa" w:w="110"/>
-            </w:tcMar>
-            <w:vAlign w:val="center"/>
-          </w:tcPr>
-          <w:p>
-            <w:pPr>
-              <w:jc w:val="right"/>
-            </w:pPr>
-            <w:r>
-              <w:rPr>
-                <w:b/>
-                <w:bCs/>
-                <w:color w:val="2F8A5F"/>
-                <w:sz w:val="18"/>
-                <w:szCs w:val="18"/>
-              </w:rPr>
-              <w:t xml:space="preserve">+2,9%</w:t>
-            </w:r>
-          </w:p>
-        </w:tc>
-        <w:tc>
-          <w:tcPr>
-            <w:tcW w:type="dxa" w:w="2000"/>
-            <w:tcBorders>
-              <w:top w:val="single" w:color="DDDDDD" w:sz="1"/>
-              <w:left w:val="single" w:color="DDDDDD" w:sz="1"/>
-              <w:bottom w:val="single" w:color="DDDDDD" w:sz="1"/>
-              <w:right w:val="single" w:color="DDDDDD" w:sz="1"/>
-            </w:tcBorders>
-            <w:tcMar>
-              <w:top w:type="dxa" w:w="55"/>
-              <w:left w:type="dxa" w:w="110"/>
-              <w:bottom w:type="dxa" w:w="55"/>
-              <w:right w:type="dxa" w:w="110"/>
-            </w:tcMar>
-            <w:vAlign w:val="center"/>
-          </w:tcPr>
-          <w:p>
-            <w:pPr>
-              <w:jc w:val="left"/>
-            </w:pPr>
-            <w:r>
-              <w:rPr>
-                <w:sz w:val="17"/>
-                <w:szCs w:val="17"/>
-              </w:rPr>
-              <w:t xml:space="preserve">Spread regional</w:t>
-            </w:r>
-          </w:p>
-        </w:tc>
-      </w:tr>
-      <w:tr>
-        <w:tc>
-          <w:tcPr>
-            <w:tcW w:type="dxa" w:w="3400"/>
-            <w:tcBorders>
-              <w:top w:val="single" w:color="DDDDDD" w:sz="1"/>
-              <w:left w:val="single" w:color="DDDDDD" w:sz="1"/>
-              <w:bottom w:val="single" w:color="DDDDDD" w:sz="1"/>
-              <w:right w:val="single" w:color="DDDDDD" w:sz="1"/>
-            </w:tcBorders>
-            <w:tcMar>
-              <w:top w:type="dxa" w:w="55"/>
-              <w:left w:type="dxa" w:w="110"/>
-              <w:bottom w:type="dxa" w:w="55"/>
-              <w:right w:type="dxa" w:w="110"/>
-            </w:tcMar>
-            <w:vAlign w:val="center"/>
-          </w:tcPr>
-          <w:p>
-            <w:pPr>
-              <w:jc w:val="left"/>
-            </w:pPr>
-            <w:r>
-              <w:rPr>
-                <w:sz w:val="18"/>
-                <w:szCs w:val="18"/>
-              </w:rPr>
-              <w:t xml:space="preserve">Troca Soja/MAP</w:t>
-            </w:r>
-          </w:p>
-        </w:tc>
-        <w:tc>
-          <w:tcPr>
-            <w:tcW w:type="dxa" w:w="1980"/>
-            <w:tcBorders>
-              <w:top w:val="single" w:color="DDDDDD" w:sz="1"/>
-              <w:left w:val="single" w:color="DDDDDD" w:sz="1"/>
-              <w:bottom w:val="single" w:color="DDDDDD" w:sz="1"/>
-              <w:right w:val="single" w:color="DDDDDD" w:sz="1"/>
-            </w:tcBorders>
-            <w:tcMar>
-              <w:top w:type="dxa" w:w="55"/>
-              <w:left w:type="dxa" w:w="110"/>
-              <w:bottom w:type="dxa" w:w="55"/>
-              <w:right w:type="dxa" w:w="110"/>
-            </w:tcMar>
-            <w:vAlign w:val="center"/>
-          </w:tcPr>
-          <w:p>
-            <w:pPr>
-              <w:jc w:val="right"/>
-            </w:pPr>
-            <w:r>
-              <w:rPr>
-                <w:sz w:val="18"/>
-                <w:szCs w:val="18"/>
-              </w:rPr>
-              <w:t xml:space="preserve">28,6 sc/t</w:t>
-            </w:r>
-          </w:p>
-        </w:tc>
-        <w:tc>
-          <w:tcPr>
-            <w:tcW w:type="dxa" w:w="1980"/>
-            <w:tcBorders>
-              <w:top w:val="single" w:color="DDDDDD" w:sz="1"/>
-              <w:left w:val="single" w:color="DDDDDD" w:sz="1"/>
-              <w:bottom w:val="single" w:color="DDDDDD" w:sz="1"/>
-              <w:right w:val="single" w:color="DDDDDD" w:sz="1"/>
-            </w:tcBorders>
-            <w:tcMar>
-              <w:top w:type="dxa" w:w="55"/>
-              <w:left w:type="dxa" w:w="110"/>
-              <w:bottom w:type="dxa" w:w="55"/>
-              <w:right w:type="dxa" w:w="110"/>
-            </w:tcMar>
-            <w:vAlign w:val="center"/>
-          </w:tcPr>
-          <w:p>
-            <w:pPr>
-              <w:jc w:val="right"/>
-            </w:pPr>
-            <w:r>
-              <w:rPr>
-                <w:b/>
-                <w:bCs/>
-                <w:color w:val="2F8A5F"/>
-                <w:sz w:val="18"/>
-                <w:szCs w:val="18"/>
-              </w:rPr>
-              <w:t xml:space="preserve">-1,0%</w:t>
-            </w:r>
-          </w:p>
-        </w:tc>
-        <w:tc>
-          <w:tcPr>
-            <w:tcW w:type="dxa" w:w="2000"/>
-            <w:tcBorders>
-              <w:top w:val="single" w:color="DDDDDD" w:sz="1"/>
-              <w:left w:val="single" w:color="DDDDDD" w:sz="1"/>
-              <w:bottom w:val="single" w:color="DDDDDD" w:sz="1"/>
-              <w:right w:val="single" w:color="DDDDDD" w:sz="1"/>
-            </w:tcBorders>
-            <w:tcMar>
-              <w:top w:type="dxa" w:w="55"/>
-              <w:left w:type="dxa" w:w="110"/>
-              <w:bottom w:type="dxa" w:w="55"/>
-              <w:right w:type="dxa" w:w="110"/>
-            </w:tcMar>
-            <w:vAlign w:val="center"/>
-          </w:tcPr>
-          <w:p>
-            <w:pPr>
-              <w:jc w:val="left"/>
-            </w:pPr>
-            <w:r>
-              <w:rPr>
-                <w:sz w:val="17"/>
-                <w:szCs w:val="17"/>
-              </w:rPr>
-              <w:t xml:space="preserve">Melhora</w:t>
-            </w:r>
-          </w:p>
-        </w:tc>
-      </w:tr>
-      <w:tr>
-        <w:tc>
-          <w:tcPr>
-            <w:tcW w:type="dxa" w:w="3400"/>
-            <w:tcBorders>
-              <w:top w:val="single" w:color="DDDDDD" w:sz="1"/>
-              <w:left w:val="single" w:color="DDDDDD" w:sz="1"/>
-              <w:bottom w:val="single" w:color="DDDDDD" w:sz="1"/>
-              <w:right w:val="single" w:color="DDDDDD" w:sz="1"/>
-            </w:tcBorders>
-            <w:tcMar>
-              <w:top w:type="dxa" w:w="55"/>
-              <w:left w:type="dxa" w:w="110"/>
-              <w:bottom w:type="dxa" w:w="55"/>
-              <w:right w:type="dxa" w:w="110"/>
-            </w:tcMar>
-            <w:vAlign w:val="center"/>
-          </w:tcPr>
-          <w:p>
-            <w:pPr>
-              <w:jc w:val="left"/>
-            </w:pPr>
-            <w:r>
-              <w:rPr>
-                <w:sz w:val="18"/>
-                <w:szCs w:val="18"/>
-              </w:rPr>
-              <w:t xml:space="preserve">Troca Soja/Ureia</w:t>
-            </w:r>
-          </w:p>
-        </w:tc>
-        <w:tc>
-          <w:tcPr>
-            <w:tcW w:type="dxa" w:w="1980"/>
-            <w:tcBorders>
-              <w:top w:val="single" w:color="DDDDDD" w:sz="1"/>
-              <w:left w:val="single" w:color="DDDDDD" w:sz="1"/>
-              <w:bottom w:val="single" w:color="DDDDDD" w:sz="1"/>
-              <w:right w:val="single" w:color="DDDDDD" w:sz="1"/>
-            </w:tcBorders>
-            <w:tcMar>
-              <w:top w:type="dxa" w:w="55"/>
-              <w:left w:type="dxa" w:w="110"/>
-              <w:bottom w:type="dxa" w:w="55"/>
-              <w:right w:type="dxa" w:w="110"/>
-            </w:tcMar>
-            <w:vAlign w:val="center"/>
-          </w:tcPr>
-          <w:p>
-            <w:pPr>
-              <w:jc w:val="right"/>
-            </w:pPr>
-            <w:r>
-              <w:rPr>
-                <w:sz w:val="18"/>
-                <w:szCs w:val="18"/>
-              </w:rPr>
-              <w:t xml:space="preserve">14,4 sc/t</w:t>
+              <w:t xml:space="preserve">17,3 sc/t</w:t>
             </w:r>
           </w:p>
         </w:tc>
@@ -1528,7 +1528,257 @@
                 <w:sz w:val="18"/>
                 <w:szCs w:val="18"/>
               </w:rPr>
-              <w:t xml:space="preserve">5,09</w:t>
+              <w:t xml:space="preserve">5,17</w:t>
+            </w:r>
+          </w:p>
+        </w:tc>
+        <w:tc>
+          <w:tcPr>
+            <w:tcW w:type="dxa" w:w="1980"/>
+            <w:tcBorders>
+              <w:top w:val="single" w:color="DDDDDD" w:sz="1"/>
+              <w:left w:val="single" w:color="DDDDDD" w:sz="1"/>
+              <w:bottom w:val="single" w:color="DDDDDD" w:sz="1"/>
+              <w:right w:val="single" w:color="DDDDDD" w:sz="1"/>
+            </w:tcBorders>
+            <w:tcMar>
+              <w:top w:type="dxa" w:w="55"/>
+              <w:left w:type="dxa" w:w="110"/>
+              <w:bottom w:type="dxa" w:w="55"/>
+              <w:right w:type="dxa" w:w="110"/>
+            </w:tcMar>
+            <w:vAlign w:val="center"/>
+          </w:tcPr>
+          <w:p>
+            <w:pPr>
+              <w:jc w:val="right"/>
+            </w:pPr>
+            <w:r>
+              <w:rPr>
+                <w:b/>
+                <w:bCs/>
+                <w:color w:val="B23636"/>
+                <w:sz w:val="18"/>
+                <w:szCs w:val="18"/>
+              </w:rPr>
+              <w:t xml:space="preserve">+1,6%</w:t>
+            </w:r>
+          </w:p>
+        </w:tc>
+        <w:tc>
+          <w:tcPr>
+            <w:tcW w:type="dxa" w:w="2000"/>
+            <w:tcBorders>
+              <w:top w:val="single" w:color="DDDDDD" w:sz="1"/>
+              <w:left w:val="single" w:color="DDDDDD" w:sz="1"/>
+              <w:bottom w:val="single" w:color="DDDDDD" w:sz="1"/>
+              <w:right w:val="single" w:color="DDDDDD" w:sz="1"/>
+            </w:tcBorders>
+            <w:tcMar>
+              <w:top w:type="dxa" w:w="55"/>
+              <w:left w:type="dxa" w:w="110"/>
+              <w:bottom w:type="dxa" w:w="55"/>
+              <w:right w:type="dxa" w:w="110"/>
+            </w:tcMar>
+            <w:vAlign w:val="center"/>
+          </w:tcPr>
+          <w:p>
+            <w:pPr>
+              <w:jc w:val="left"/>
+            </w:pPr>
+            <w:r>
+              <w:rPr>
+                <w:sz w:val="17"/>
+                <w:szCs w:val="17"/>
+              </w:rPr>
+              <w:t xml:space="preserve">Custo de importação</w:t>
+            </w:r>
+          </w:p>
+        </w:tc>
+      </w:tr>
+      <w:tr>
+        <w:tc>
+          <w:tcPr>
+            <w:tcW w:type="dxa" w:w="3400"/>
+            <w:tcBorders>
+              <w:top w:val="single" w:color="DDDDDD" w:sz="1"/>
+              <w:left w:val="single" w:color="DDDDDD" w:sz="1"/>
+              <w:bottom w:val="single" w:color="DDDDDD" w:sz="1"/>
+              <w:right w:val="single" w:color="DDDDDD" w:sz="1"/>
+            </w:tcBorders>
+            <w:tcMar>
+              <w:top w:type="dxa" w:w="55"/>
+              <w:left w:type="dxa" w:w="110"/>
+              <w:bottom w:type="dxa" w:w="55"/>
+              <w:right w:type="dxa" w:w="110"/>
+            </w:tcMar>
+            <w:vAlign w:val="center"/>
+          </w:tcPr>
+          <w:p>
+            <w:pPr>
+              <w:jc w:val="left"/>
+            </w:pPr>
+            <w:r>
+              <w:rPr>
+                <w:sz w:val="18"/>
+                <w:szCs w:val="18"/>
+              </w:rPr>
+              <w:t xml:space="preserve">Gás Natural (Henry Hub)</w:t>
+            </w:r>
+          </w:p>
+        </w:tc>
+        <w:tc>
+          <w:tcPr>
+            <w:tcW w:type="dxa" w:w="1980"/>
+            <w:tcBorders>
+              <w:top w:val="single" w:color="DDDDDD" w:sz="1"/>
+              <w:left w:val="single" w:color="DDDDDD" w:sz="1"/>
+              <w:bottom w:val="single" w:color="DDDDDD" w:sz="1"/>
+              <w:right w:val="single" w:color="DDDDDD" w:sz="1"/>
+            </w:tcBorders>
+            <w:tcMar>
+              <w:top w:type="dxa" w:w="55"/>
+              <w:left w:type="dxa" w:w="110"/>
+              <w:bottom w:type="dxa" w:w="55"/>
+              <w:right w:type="dxa" w:w="110"/>
+            </w:tcMar>
+            <w:vAlign w:val="center"/>
+          </w:tcPr>
+          <w:p>
+            <w:pPr>
+              <w:jc w:val="right"/>
+            </w:pPr>
+            <w:r>
+              <w:rPr>
+                <w:sz w:val="18"/>
+                <w:szCs w:val="18"/>
+              </w:rPr>
+              <w:t xml:space="preserve">US$ 2,81</w:t>
+            </w:r>
+          </w:p>
+        </w:tc>
+        <w:tc>
+          <w:tcPr>
+            <w:tcW w:type="dxa" w:w="1980"/>
+            <w:tcBorders>
+              <w:top w:val="single" w:color="DDDDDD" w:sz="1"/>
+              <w:left w:val="single" w:color="DDDDDD" w:sz="1"/>
+              <w:bottom w:val="single" w:color="DDDDDD" w:sz="1"/>
+              <w:right w:val="single" w:color="DDDDDD" w:sz="1"/>
+            </w:tcBorders>
+            <w:tcMar>
+              <w:top w:type="dxa" w:w="55"/>
+              <w:left w:type="dxa" w:w="110"/>
+              <w:bottom w:type="dxa" w:w="55"/>
+              <w:right w:type="dxa" w:w="110"/>
+            </w:tcMar>
+            <w:vAlign w:val="center"/>
+          </w:tcPr>
+          <w:p>
+            <w:pPr>
+              <w:jc w:val="right"/>
+            </w:pPr>
+            <w:r>
+              <w:rPr>
+                <w:b/>
+                <w:bCs/>
+                <w:color w:val="6B7585"/>
+                <w:sz w:val="18"/>
+                <w:szCs w:val="18"/>
+              </w:rPr>
+              <w:t xml:space="preserve">0,0%</w:t>
+            </w:r>
+          </w:p>
+        </w:tc>
+        <w:tc>
+          <w:tcPr>
+            <w:tcW w:type="dxa" w:w="2000"/>
+            <w:tcBorders>
+              <w:top w:val="single" w:color="DDDDDD" w:sz="1"/>
+              <w:left w:val="single" w:color="DDDDDD" w:sz="1"/>
+              <w:bottom w:val="single" w:color="DDDDDD" w:sz="1"/>
+              <w:right w:val="single" w:color="DDDDDD" w:sz="1"/>
+            </w:tcBorders>
+            <w:tcMar>
+              <w:top w:type="dxa" w:w="55"/>
+              <w:left w:type="dxa" w:w="110"/>
+              <w:bottom w:type="dxa" w:w="55"/>
+              <w:right w:type="dxa" w:w="110"/>
+            </w:tcMar>
+            <w:vAlign w:val="center"/>
+          </w:tcPr>
+          <w:p>
+            <w:pPr>
+              <w:jc w:val="left"/>
+            </w:pPr>
+            <w:r>
+              <w:rPr>
+                <w:sz w:val="17"/>
+                <w:szCs w:val="17"/>
+              </w:rPr>
+              <w:t xml:space="preserve">Pressiona ureia</w:t>
+            </w:r>
+          </w:p>
+        </w:tc>
+      </w:tr>
+      <w:tr>
+        <w:tc>
+          <w:tcPr>
+            <w:tcW w:type="dxa" w:w="3400"/>
+            <w:tcBorders>
+              <w:top w:val="single" w:color="DDDDDD" w:sz="1"/>
+              <w:left w:val="single" w:color="DDDDDD" w:sz="1"/>
+              <w:bottom w:val="single" w:color="DDDDDD" w:sz="1"/>
+              <w:right w:val="single" w:color="DDDDDD" w:sz="1"/>
+            </w:tcBorders>
+            <w:tcMar>
+              <w:top w:type="dxa" w:w="55"/>
+              <w:left w:type="dxa" w:w="110"/>
+              <w:bottom w:type="dxa" w:w="55"/>
+              <w:right w:type="dxa" w:w="110"/>
+            </w:tcMar>
+            <w:vAlign w:val="center"/>
+          </w:tcPr>
+          <w:p>
+            <w:pPr>
+              <w:jc w:val="left"/>
+            </w:pPr>
+            <w:r>
+              <w:rPr>
+                <w:sz w:val="18"/>
+                <w:szCs w:val="18"/>
+              </w:rPr>
+              <w:t xml:space="preserve">Frete Marítimo (BDI)</w:t>
+            </w:r>
+          </w:p>
+        </w:tc>
+        <w:tc>
+          <w:tcPr>
+            <w:tcW w:type="dxa" w:w="1980"/>
+            <w:tcBorders>
+              <w:top w:val="single" w:color="DDDDDD" w:sz="1"/>
+              <w:left w:val="single" w:color="DDDDDD" w:sz="1"/>
+              <w:bottom w:val="single" w:color="DDDDDD" w:sz="1"/>
+              <w:right w:val="single" w:color="DDDDDD" w:sz="1"/>
+            </w:tcBorders>
+            <w:tcMar>
+              <w:top w:type="dxa" w:w="55"/>
+              <w:left w:type="dxa" w:w="110"/>
+              <w:bottom w:type="dxa" w:w="55"/>
+              <w:right w:type="dxa" w:w="110"/>
+            </w:tcMar>
+            <w:vAlign w:val="center"/>
+          </w:tcPr>
+          <w:p>
+            <w:pPr>
+              <w:jc w:val="right"/>
+            </w:pPr>
+            <w:r>
+              <w:rPr>
+                <w:sz w:val="18"/>
+                <w:szCs w:val="18"/>
+              </w:rPr>
+              <w:t xml:space="preserve">3.445 pts</w:t>
             </w:r>
           </w:p>
         </w:tc>
@@ -1561,257 +1811,7 @@
                 <w:sz w:val="18"/>
                 <w:szCs w:val="18"/>
               </w:rPr>
-              <w:t xml:space="preserve">-0,8%</w:t>
-            </w:r>
-          </w:p>
-        </w:tc>
-        <w:tc>
-          <w:tcPr>
-            <w:tcW w:type="dxa" w:w="2000"/>
-            <w:tcBorders>
-              <w:top w:val="single" w:color="DDDDDD" w:sz="1"/>
-              <w:left w:val="single" w:color="DDDDDD" w:sz="1"/>
-              <w:bottom w:val="single" w:color="DDDDDD" w:sz="1"/>
-              <w:right w:val="single" w:color="DDDDDD" w:sz="1"/>
-            </w:tcBorders>
-            <w:tcMar>
-              <w:top w:type="dxa" w:w="55"/>
-              <w:left w:type="dxa" w:w="110"/>
-              <w:bottom w:type="dxa" w:w="55"/>
-              <w:right w:type="dxa" w:w="110"/>
-            </w:tcMar>
-            <w:vAlign w:val="center"/>
-          </w:tcPr>
-          <w:p>
-            <w:pPr>
-              <w:jc w:val="left"/>
-            </w:pPr>
-            <w:r>
-              <w:rPr>
-                <w:sz w:val="17"/>
-                <w:szCs w:val="17"/>
-              </w:rPr>
-              <w:t xml:space="preserve">Custo de importação</w:t>
-            </w:r>
-          </w:p>
-        </w:tc>
-      </w:tr>
-      <w:tr>
-        <w:tc>
-          <w:tcPr>
-            <w:tcW w:type="dxa" w:w="3400"/>
-            <w:tcBorders>
-              <w:top w:val="single" w:color="DDDDDD" w:sz="1"/>
-              <w:left w:val="single" w:color="DDDDDD" w:sz="1"/>
-              <w:bottom w:val="single" w:color="DDDDDD" w:sz="1"/>
-              <w:right w:val="single" w:color="DDDDDD" w:sz="1"/>
-            </w:tcBorders>
-            <w:tcMar>
-              <w:top w:type="dxa" w:w="55"/>
-              <w:left w:type="dxa" w:w="110"/>
-              <w:bottom w:type="dxa" w:w="55"/>
-              <w:right w:type="dxa" w:w="110"/>
-            </w:tcMar>
-            <w:vAlign w:val="center"/>
-          </w:tcPr>
-          <w:p>
-            <w:pPr>
-              <w:jc w:val="left"/>
-            </w:pPr>
-            <w:r>
-              <w:rPr>
-                <w:sz w:val="18"/>
-                <w:szCs w:val="18"/>
-              </w:rPr>
-              <w:t xml:space="preserve">Gás Natural (Henry Hub)</w:t>
-            </w:r>
-          </w:p>
-        </w:tc>
-        <w:tc>
-          <w:tcPr>
-            <w:tcW w:type="dxa" w:w="1980"/>
-            <w:tcBorders>
-              <w:top w:val="single" w:color="DDDDDD" w:sz="1"/>
-              <w:left w:val="single" w:color="DDDDDD" w:sz="1"/>
-              <w:bottom w:val="single" w:color="DDDDDD" w:sz="1"/>
-              <w:right w:val="single" w:color="DDDDDD" w:sz="1"/>
-            </w:tcBorders>
-            <w:tcMar>
-              <w:top w:type="dxa" w:w="55"/>
-              <w:left w:type="dxa" w:w="110"/>
-              <w:bottom w:type="dxa" w:w="55"/>
-              <w:right w:type="dxa" w:w="110"/>
-            </w:tcMar>
-            <w:vAlign w:val="center"/>
-          </w:tcPr>
-          <w:p>
-            <w:pPr>
-              <w:jc w:val="right"/>
-            </w:pPr>
-            <w:r>
-              <w:rPr>
-                <w:sz w:val="18"/>
-                <w:szCs w:val="18"/>
-              </w:rPr>
-              <w:t xml:space="preserve">US$ 2,81</w:t>
-            </w:r>
-          </w:p>
-        </w:tc>
-        <w:tc>
-          <w:tcPr>
-            <w:tcW w:type="dxa" w:w="1980"/>
-            <w:tcBorders>
-              <w:top w:val="single" w:color="DDDDDD" w:sz="1"/>
-              <w:left w:val="single" w:color="DDDDDD" w:sz="1"/>
-              <w:bottom w:val="single" w:color="DDDDDD" w:sz="1"/>
-              <w:right w:val="single" w:color="DDDDDD" w:sz="1"/>
-            </w:tcBorders>
-            <w:tcMar>
-              <w:top w:type="dxa" w:w="55"/>
-              <w:left w:type="dxa" w:w="110"/>
-              <w:bottom w:type="dxa" w:w="55"/>
-              <w:right w:type="dxa" w:w="110"/>
-            </w:tcMar>
-            <w:vAlign w:val="center"/>
-          </w:tcPr>
-          <w:p>
-            <w:pPr>
-              <w:jc w:val="right"/>
-            </w:pPr>
-            <w:r>
-              <w:rPr>
-                <w:b/>
-                <w:bCs/>
-                <w:color w:val="2F8A5F"/>
-                <w:sz w:val="18"/>
-                <w:szCs w:val="18"/>
-              </w:rPr>
-              <w:t xml:space="preserve">-3,1%</w:t>
-            </w:r>
-          </w:p>
-        </w:tc>
-        <w:tc>
-          <w:tcPr>
-            <w:tcW w:type="dxa" w:w="2000"/>
-            <w:tcBorders>
-              <w:top w:val="single" w:color="DDDDDD" w:sz="1"/>
-              <w:left w:val="single" w:color="DDDDDD" w:sz="1"/>
-              <w:bottom w:val="single" w:color="DDDDDD" w:sz="1"/>
-              <w:right w:val="single" w:color="DDDDDD" w:sz="1"/>
-            </w:tcBorders>
-            <w:tcMar>
-              <w:top w:type="dxa" w:w="55"/>
-              <w:left w:type="dxa" w:w="110"/>
-              <w:bottom w:type="dxa" w:w="55"/>
-              <w:right w:type="dxa" w:w="110"/>
-            </w:tcMar>
-            <w:vAlign w:val="center"/>
-          </w:tcPr>
-          <w:p>
-            <w:pPr>
-              <w:jc w:val="left"/>
-            </w:pPr>
-            <w:r>
-              <w:rPr>
-                <w:sz w:val="17"/>
-                <w:szCs w:val="17"/>
-              </w:rPr>
-              <w:t xml:space="preserve">Pressiona ureia</w:t>
-            </w:r>
-          </w:p>
-        </w:tc>
-      </w:tr>
-      <w:tr>
-        <w:tc>
-          <w:tcPr>
-            <w:tcW w:type="dxa" w:w="3400"/>
-            <w:tcBorders>
-              <w:top w:val="single" w:color="DDDDDD" w:sz="1"/>
-              <w:left w:val="single" w:color="DDDDDD" w:sz="1"/>
-              <w:bottom w:val="single" w:color="DDDDDD" w:sz="1"/>
-              <w:right w:val="single" w:color="DDDDDD" w:sz="1"/>
-            </w:tcBorders>
-            <w:tcMar>
-              <w:top w:type="dxa" w:w="55"/>
-              <w:left w:type="dxa" w:w="110"/>
-              <w:bottom w:type="dxa" w:w="55"/>
-              <w:right w:type="dxa" w:w="110"/>
-            </w:tcMar>
-            <w:vAlign w:val="center"/>
-          </w:tcPr>
-          <w:p>
-            <w:pPr>
-              <w:jc w:val="left"/>
-            </w:pPr>
-            <w:r>
-              <w:rPr>
-                <w:sz w:val="18"/>
-                <w:szCs w:val="18"/>
-              </w:rPr>
-              <w:t xml:space="preserve">Frete Marítimo (BDI)</w:t>
-            </w:r>
-          </w:p>
-        </w:tc>
-        <w:tc>
-          <w:tcPr>
-            <w:tcW w:type="dxa" w:w="1980"/>
-            <w:tcBorders>
-              <w:top w:val="single" w:color="DDDDDD" w:sz="1"/>
-              <w:left w:val="single" w:color="DDDDDD" w:sz="1"/>
-              <w:bottom w:val="single" w:color="DDDDDD" w:sz="1"/>
-              <w:right w:val="single" w:color="DDDDDD" w:sz="1"/>
-            </w:tcBorders>
-            <w:tcMar>
-              <w:top w:type="dxa" w:w="55"/>
-              <w:left w:type="dxa" w:w="110"/>
-              <w:bottom w:type="dxa" w:w="55"/>
-              <w:right w:type="dxa" w:w="110"/>
-            </w:tcMar>
-            <w:vAlign w:val="center"/>
-          </w:tcPr>
-          <w:p>
-            <w:pPr>
-              <w:jc w:val="right"/>
-            </w:pPr>
-            <w:r>
-              <w:rPr>
-                <w:sz w:val="18"/>
-                <w:szCs w:val="18"/>
-              </w:rPr>
-              <w:t xml:space="preserve">3.507 pts</w:t>
-            </w:r>
-          </w:p>
-        </w:tc>
-        <w:tc>
-          <w:tcPr>
-            <w:tcW w:type="dxa" w:w="1980"/>
-            <w:tcBorders>
-              <w:top w:val="single" w:color="DDDDDD" w:sz="1"/>
-              <w:left w:val="single" w:color="DDDDDD" w:sz="1"/>
-              <w:bottom w:val="single" w:color="DDDDDD" w:sz="1"/>
-              <w:right w:val="single" w:color="DDDDDD" w:sz="1"/>
-            </w:tcBorders>
-            <w:tcMar>
-              <w:top w:type="dxa" w:w="55"/>
-              <w:left w:type="dxa" w:w="110"/>
-              <w:bottom w:type="dxa" w:w="55"/>
-              <w:right w:type="dxa" w:w="110"/>
-            </w:tcMar>
-            <w:vAlign w:val="center"/>
-          </w:tcPr>
-          <w:p>
-            <w:pPr>
-              <w:jc w:val="right"/>
-            </w:pPr>
-            <w:r>
-              <w:rPr>
-                <w:b/>
-                <w:bCs/>
-                <w:color w:val="2F8A5F"/>
-                <w:sz w:val="18"/>
-                <w:szCs w:val="18"/>
-              </w:rPr>
-              <w:t xml:space="preserve">-1,9%</w:t>
+              <w:t xml:space="preserve">-1,8%</w:t>
             </w:r>
           </w:p>
         </w:tc>
@@ -1881,14 +1881,14 @@
           <w:sz w:val="18"/>
           <w:szCs w:val="18"/>
         </w:rPr>
-        <w:t xml:space="preserve">Gás Natural: </w:t>
+        <w:t xml:space="preserve">MAP: </w:t>
       </w:r>
       <w:r>
         <w:rPr>
           <w:sz w:val="18"/>
           <w:szCs w:val="18"/>
         </w:rPr>
-        <w:t xml:space="preserve">queda de -3,1% no período.</w:t>
+        <w:t xml:space="preserve">queda de -23,3% no período.</w:t>
       </w:r>
     </w:p>
     <w:p>
@@ -1907,14 +1907,14 @@
           <w:sz w:val="18"/>
           <w:szCs w:val="18"/>
         </w:rPr>
-        <w:t xml:space="preserve">BDI: </w:t>
+        <w:t xml:space="preserve">Ureia: </w:t>
       </w:r>
       <w:r>
         <w:rPr>
           <w:sz w:val="18"/>
           <w:szCs w:val="18"/>
         </w:rPr>
-        <w:t xml:space="preserve">queda de -1,9% no período.</w:t>
+        <w:t xml:space="preserve">alta de +18,9% no período.</w:t>
       </w:r>
     </w:p>
     <w:p>
@@ -1933,90 +1933,14 @@
           <w:sz w:val="18"/>
           <w:szCs w:val="18"/>
         </w:rPr>
-        <w:t xml:space="preserve">Dólar: </w:t>
+        <w:t xml:space="preserve">KCl: </w:t>
       </w:r>
       <w:r>
         <w:rPr>
           <w:sz w:val="18"/>
           <w:szCs w:val="18"/>
         </w:rPr>
-        <w:t xml:space="preserve">queda de -0,8% no período.</w:t>
-      </w:r>
-    </w:p>
-    <w:p>
-      <w:pPr>
-        <w:pBdr>
-          <w:bottom w:val="single" w:color="1E2A44" w:sz="6" w:space="2"/>
-        </w:pBdr>
-        <w:spacing w:after="100" w:before="220"/>
-      </w:pPr>
-      <w:r>
-        <w:rPr>
-          <w:b/>
-          <w:bCs/>
-          <w:color w:val="1E2A44"/>
-          <w:sz w:val="22"/>
-          <w:szCs w:val="22"/>
-        </w:rPr>
-        <w:t xml:space="preserve">6. Contexto de Mercado — Causas da Alta e Perspectivas</w:t>
-      </w:r>
-    </w:p>
-    <w:p>
-      <w:pPr>
-        <w:spacing w:after="60"/>
-      </w:pPr>
-      <w:r>
-        <w:rPr>
-          <w:b/>
-          <w:bCs/>
-          <w:color w:val="1E2A44"/>
-          <w:sz w:val="18"/>
-          <w:szCs w:val="18"/>
-        </w:rPr>
-        <w:t xml:space="preserve">Por que os fertilizantes subiram — e o que esperar · atualizado em Setembro/2026 · revisão manual.</w:t>
-      </w:r>
-    </w:p>
-    <w:p>
-      <w:pPr>
-        <w:spacing w:after="60"/>
-        <w:jc w:val="both"/>
-      </w:pPr>
-      <w:r>
-        <w:rPr>
-          <w:sz w:val="18"/>
-          <w:szCs w:val="18"/>
-        </w:rPr>
-        <w:t xml:space="preserve">Em setembro o quadro é de alívio parcial, não de normalização: os preços recuaram dos picos e a China voltou a exportar, mas a oferta segue apertada — sobretudo nos fosfatados (MAP) — e o abastecimento da safra 2026/27 virou a principal preocupação, com importações atrasadas e o governo atuando na logística dos portos.</w:t>
-      </w:r>
-    </w:p>
-    <w:p>
-      <w:pPr>
-        <w:spacing w:after="80"/>
-      </w:pPr>
-      <w:r>
-        <w:rPr>
-          <w:i/>
-          <w:iCs/>
-          <w:color w:val="6B7585"/>
-          <w:sz w:val="17"/>
-          <w:szCs w:val="17"/>
-        </w:rPr>
-        <w:t xml:space="preserve">Leitura automática: sem novo fechamento de fertilizantes desde a leitura anterior (ago/26).</w:t>
-      </w:r>
-    </w:p>
-    <w:p>
-      <w:pPr>
-        <w:spacing w:after="40"/>
-      </w:pPr>
-      <w:r>
-        <w:rPr>
-          <w:b/>
-          <w:bCs/>
-          <w:color w:val="1E2A44"/>
-          <w:sz w:val="18"/>
-          <w:szCs w:val="18"/>
-        </w:rPr>
-        <w:t xml:space="preserve">Principais causas da alta:</w:t>
+        <w:t xml:space="preserve">queda de -6,8% no período.</w:t>
       </w:r>
     </w:p>
     <w:p>
@@ -2032,17 +1956,93 @@
         <w:rPr>
           <w:b/>
           <w:bCs/>
+          <w:sz w:val="18"/>
+          <w:szCs w:val="18"/>
+        </w:rPr>
+        <w:t xml:space="preserve">BDI: </w:t>
+      </w:r>
+      <w:r>
+        <w:rPr>
+          <w:sz w:val="18"/>
+          <w:szCs w:val="18"/>
+        </w:rPr>
+        <w:t xml:space="preserve">queda de -1,8% no período.</w:t>
+      </w:r>
+    </w:p>
+    <w:p>
+      <w:pPr>
+        <w:pBdr>
+          <w:bottom w:val="single" w:color="1E2A44" w:sz="6" w:space="2"/>
+        </w:pBdr>
+        <w:spacing w:after="100" w:before="220"/>
+      </w:pPr>
+      <w:r>
+        <w:rPr>
+          <w:b/>
+          <w:bCs/>
+          <w:color w:val="1E2A44"/>
+          <w:sz w:val="22"/>
+          <w:szCs w:val="22"/>
+        </w:rPr>
+        <w:t xml:space="preserve">6. Contexto de Mercado — Causas da Alta e Perspectivas</w:t>
+      </w:r>
+    </w:p>
+    <w:p>
+      <w:pPr>
+        <w:spacing w:after="60"/>
+      </w:pPr>
+      <w:r>
+        <w:rPr>
+          <w:b/>
+          <w:bCs/>
+          <w:color w:val="1E2A44"/>
+          <w:sz w:val="18"/>
+          <w:szCs w:val="18"/>
+        </w:rPr>
+        <w:t xml:space="preserve">Por que os fertilizantes subiram — e o que esperar · atualizado em Setembro/2026 · revisão manual.</w:t>
+      </w:r>
+    </w:p>
+    <w:p>
+      <w:pPr>
+        <w:spacing w:after="60"/>
+        <w:jc w:val="both"/>
+      </w:pPr>
+      <w:r>
+        <w:rPr>
+          <w:sz w:val="18"/>
+          <w:szCs w:val="18"/>
+        </w:rPr>
+        <w:t xml:space="preserve">Em setembro o quadro é de alívio parcial, não de normalização: os preços recuaram dos picos e a China voltou a exportar, mas a oferta segue apertada — sobretudo nos fosfatados (MAP) — e o abastecimento da safra 2026/27 virou a principal preocupação, com importações atrasadas e o governo atuando na logística dos portos.</w:t>
+      </w:r>
+    </w:p>
+    <w:p>
+      <w:pPr>
+        <w:spacing w:after="80"/>
+      </w:pPr>
+      <w:r>
+        <w:rPr>
+          <w:i/>
+          <w:iCs/>
+          <w:color w:val="6B7585"/>
           <w:sz w:val="17"/>
           <w:szCs w:val="17"/>
         </w:rPr>
-        <w:t xml:space="preserve">Fosfatados (MAP) ainda pressionados: </w:t>
-      </w:r>
-      <w:r>
-        <w:rPr>
-          <w:sz w:val="17"/>
-          <w:szCs w:val="17"/>
-        </w:rPr>
-        <w:t xml:space="preserve">É o segmento mais crítico. As importações brasileiras de MAP caíram cerca de 24% no 1º semestre; a oferta chinesa, mesmo com retomada parcial, ainda é limitada, e a escassez de enxofre (matéria-prima do MAP) mantém o custo alto.</w:t>
+        <w:t xml:space="preserve">Leitura automática — último fechamento (ago/26): Ureia +18,9%, MAP -23,3%, KCl -6,8% ante o mês anterior.</w:t>
+      </w:r>
+    </w:p>
+    <w:p>
+      <w:pPr>
+        <w:spacing w:after="40"/>
+      </w:pPr>
+      <w:r>
+        <w:rPr>
+          <w:b/>
+          <w:bCs/>
+          <w:color w:val="1E2A44"/>
+          <w:sz w:val="18"/>
+          <w:szCs w:val="18"/>
+        </w:rPr>
+        <w:t xml:space="preserve">Principais causas da alta:</w:t>
       </w:r>
     </w:p>
     <w:p>
@@ -2061,14 +2061,14 @@
           <w:sz w:val="17"/>
           <w:szCs w:val="17"/>
         </w:rPr>
-        <w:t xml:space="preserve">Escassez de enxofre: </w:t>
+        <w:t xml:space="preserve">Fosfatados (MAP) ainda pressionados: </w:t>
       </w:r>
       <w:r>
         <w:rPr>
           <w:sz w:val="17"/>
           <w:szCs w:val="17"/>
         </w:rPr>
-        <w:t xml:space="preserve">Insumo essencial dos fosfatados, o enxofre saltou de cerca de US$ 100/t no pré-guerra para a faixa de US$ 1.200/t, levando fábricas a reduzir produção e apertando ainda mais a oferta de MAP.</w:t>
+        <w:t xml:space="preserve">É o segmento mais crítico. As importações brasileiras de MAP caíram cerca de 24% no 1º semestre; a oferta chinesa, mesmo com retomada parcial, ainda é limitada, e a escassez de enxofre (matéria-prima do MAP) mantém o custo alto.</w:t>
       </w:r>
     </w:p>
     <w:p>
@@ -2087,14 +2087,14 @@
           <w:sz w:val="17"/>
           <w:szCs w:val="17"/>
         </w:rPr>
-        <w:t xml:space="preserve">China retomou exportações (alívio parcial): </w:t>
+        <w:t xml:space="preserve">Escassez de enxofre: </w:t>
       </w:r>
       <w:r>
         <w:rPr>
           <w:sz w:val="17"/>
           <w:szCs w:val="17"/>
         </w:rPr>
-        <w:t xml:space="preserve">A volta gradual dos embarques chineses trouxe algum alívio a nitrogenados e fosfatados, mas ainda não elimina o risco de desabastecimento para a safra 2026/27.</w:t>
+        <w:t xml:space="preserve">Insumo essencial dos fosfatados, o enxofre saltou de cerca de US$ 100/t no pré-guerra para a faixa de US$ 1.200/t, levando fábricas a reduzir produção e apertando ainda mais a oferta de MAP.</w:t>
       </w:r>
     </w:p>
     <w:p>
@@ -2113,14 +2113,14 @@
           <w:sz w:val="17"/>
           <w:szCs w:val="17"/>
         </w:rPr>
-        <w:t xml:space="preserve">Importações atrasadas e cautelosas: </w:t>
+        <w:t xml:space="preserve">China retomou exportações (alívio parcial): </w:t>
       </w:r>
       <w:r>
         <w:rPr>
           <w:sz w:val="17"/>
           <w:szCs w:val="17"/>
         </w:rPr>
-        <w:t xml:space="preserve">No 1º semestre os desembarques totais caíram ~8,6% (ureia −32%, MAP −24%), com compradores adiando negócios diante da volatilidade e da relação de troca ruim. O tempo para garantir o abastecimento do plantio (set–out) ficou curto.</w:t>
+        <w:t xml:space="preserve">A volta gradual dos embarques chineses trouxe algum alívio a nitrogenados e fosfatados, mas ainda não elimina o risco de desabastecimento para a safra 2026/27.</w:t>
       </w:r>
     </w:p>
     <w:p>
@@ -2139,42 +2139,14 @@
           <w:sz w:val="17"/>
           <w:szCs w:val="17"/>
         </w:rPr>
-        <w:t xml:space="preserve">Oriente Médio e logística: </w:t>
+        <w:t xml:space="preserve">Importações atrasadas e cautelosas: </w:t>
       </w:r>
       <w:r>
         <w:rPr>
           <w:sz w:val="17"/>
           <w:szCs w:val="17"/>
         </w:rPr>
-        <w:t xml:space="preserve">As tensões e a disrupção de rotas ligadas ao Estreito de Ormuz afetaram ureia, amônia, enxofre e fosfatos, e ainda pesam sobre o frete e a previsibilidade das entregas.</w:t>
-      </w:r>
-    </w:p>
-    <w:p>
-      <w:pPr>
-        <w:spacing w:after="80" w:before="40"/>
-        <w:jc w:val="both"/>
-      </w:pPr>
-      <w:r>
-        <w:rPr>
-          <w:sz w:val="17"/>
-          <w:szCs w:val="17"/>
-        </w:rPr>
-        <w:t xml:space="preserve">No 1º semestre de 2026 as importações brasileiras das principais matérias-primas caíram ~8,6%, com ureia −32%, MAP −24% e enxofre −42% (StoneX). A ureia recuou dos picos do meio do ano, mas a relação de troca segue desfavorável — o Brasil importou cerca de 7% menos fertilizante e ainda assim o produtor gastou mais. A RaboResearch reduziu a projeção de entregas no país para ~45,1 milhões de toneladas em 2026, abaixo do recorde de 2025.</w:t>
-      </w:r>
-    </w:p>
-    <w:p>
-      <w:pPr>
-        <w:spacing w:after="40" w:before="40"/>
-      </w:pPr>
-      <w:r>
-        <w:rPr>
-          <w:b/>
-          <w:bCs/>
-          <w:color w:val="1E2A44"/>
-          <w:sz w:val="18"/>
-          <w:szCs w:val="18"/>
-        </w:rPr>
-        <w:t xml:space="preserve">O que esperar nos próximos meses:</w:t>
+        <w:t xml:space="preserve">No 1º semestre os desembarques totais caíram ~8,6% (ureia −32%, MAP −24%), com compradores adiando negócios diante da volatilidade e da relação de troca ruim. O tempo para garantir o abastecimento do plantio (set–out) ficou curto.</w:t>
       </w:r>
     </w:p>
     <w:p>
@@ -2188,10 +2160,47 @@
       </w:pPr>
       <w:r>
         <w:rPr>
+          <w:b/>
+          <w:bCs/>
           <w:sz w:val="17"/>
           <w:szCs w:val="17"/>
         </w:rPr>
-        <w:t xml:space="preserve">Ureia (nitrogenados): preços fora dos extremos e acessibilidade em recuperação desde julho; espera-se retomada gradual das compras até o fim do ano, mas atrasos podem pressionar a 2ª safra de milho (plantio em jan/2027).</w:t>
+        <w:t xml:space="preserve">Oriente Médio e logística: </w:t>
+      </w:r>
+      <w:r>
+        <w:rPr>
+          <w:sz w:val="17"/>
+          <w:szCs w:val="17"/>
+        </w:rPr>
+        <w:t xml:space="preserve">As tensões e a disrupção de rotas ligadas ao Estreito de Ormuz afetaram ureia, amônia, enxofre e fosfatos, e ainda pesam sobre o frete e a previsibilidade das entregas.</w:t>
+      </w:r>
+    </w:p>
+    <w:p>
+      <w:pPr>
+        <w:spacing w:after="80" w:before="40"/>
+        <w:jc w:val="both"/>
+      </w:pPr>
+      <w:r>
+        <w:rPr>
+          <w:sz w:val="17"/>
+          <w:szCs w:val="17"/>
+        </w:rPr>
+        <w:t xml:space="preserve">No 1º semestre de 2026 as importações brasileiras das principais matérias-primas caíram ~8,6%, com ureia −32%, MAP −24% e enxofre −42% (StoneX). A ureia recuou dos picos do meio do ano, mas a relação de troca segue desfavorável — o Brasil importou cerca de 7% menos fertilizante e ainda assim o produtor gastou mais. A RaboResearch reduziu a projeção de entregas no país para ~45,1 milhões de toneladas em 2026, abaixo do recorde de 2025.</w:t>
+      </w:r>
+    </w:p>
+    <w:p>
+      <w:pPr>
+        <w:spacing w:after="40" w:before="40"/>
+      </w:pPr>
+      <w:r>
+        <w:rPr>
+          <w:b/>
+          <w:bCs/>
+          <w:color w:val="1E2A44"/>
+          <w:sz w:val="18"/>
+          <w:szCs w:val="18"/>
+        </w:rPr>
+        <w:t xml:space="preserve">O que esperar nos próximos meses:</w:t>
       </w:r>
     </w:p>
     <w:p>
@@ -2208,7 +2217,7 @@
           <w:sz w:val="17"/>
           <w:szCs w:val="17"/>
         </w:rPr>
-        <w:t xml:space="preserve">MAP (fosfatados): segue o ponto mais delicado; oferta apertada e enxofre caro limitam quedas, com risco de faltar produto no pico de plantio (set–out).</w:t>
+        <w:t xml:space="preserve">Ureia (nitrogenados): preços fora dos extremos e acessibilidade em recuperação desde julho; espera-se retomada gradual das compras até o fim do ano, mas atrasos podem pressionar a 2ª safra de milho (plantio em jan/2027).</w:t>
       </w:r>
     </w:p>
     <w:p>
@@ -2225,7 +2234,7 @@
           <w:sz w:val="17"/>
           <w:szCs w:val="17"/>
         </w:rPr>
-        <w:t xml:space="preserve">KCl (potássio): segmento mais confortável e com preços entre os mais favoráveis em anos; boa janela de reposição.</w:t>
+        <w:t xml:space="preserve">MAP (fosfatados): segue o ponto mais delicado; oferta apertada e enxofre caro limitam quedas, com risco de faltar produto no pico de plantio (set–out).</w:t>
       </w:r>
     </w:p>
     <w:p>
@@ -2242,7 +2251,7 @@
           <w:sz w:val="17"/>
           <w:szCs w:val="17"/>
         </w:rPr>
-        <w:t xml:space="preserve">Ação do governo: a Casa Civil mantém a Sala de Situação sobre Fertilizantes, e foi publicada resolução (ago/2026, validade de 6 meses) priorizando o desembarque de fertilizantes nos portos públicos para garantir o abastecimento da safra 2026/27.</w:t>
+        <w:t xml:space="preserve">KCl (potássio): segmento mais confortável e com preços entre os mais favoráveis em anos; boa janela de reposição.</w:t>
       </w:r>
     </w:p>
     <w:p>
@@ -2259,22 +2268,7 @@
           <w:sz w:val="17"/>
           <w:szCs w:val="17"/>
         </w:rPr>
-        <w:t xml:space="preserve">Riscos a monitorar: duração do conflito e normalização do Estreito de Ormuz, ritmo real da oferta chinesa, preço do enxofre, câmbio, crédito rural apertado e clima (risco de El Niño forte).</w:t>
-      </w:r>
-    </w:p>
-    <w:p>
-      <w:pPr>
-        <w:spacing w:after="20" w:before="60"/>
-      </w:pPr>
-      <w:r>
-        <w:rPr>
-          <w:b/>
-          <w:bCs/>
-          <w:color w:val="1E2A44"/>
-          <w:sz w:val="17"/>
-          <w:szCs w:val="17"/>
-        </w:rPr>
-        <w:t xml:space="preserve">Notícias recentes do mercado (atualização automática):</w:t>
+        <w:t xml:space="preserve">Ação do governo: a Casa Civil mantém a Sala de Situação sobre Fertilizantes, e foi publicada resolução (ago/2026, validade de 6 meses) priorizando o desembarque de fertilizantes nos portos públicos para garantir o abastecimento da safra 2026/27.</w:t>
       </w:r>
     </w:p>
     <w:p>
@@ -2288,10 +2282,25 @@
       </w:pPr>
       <w:r>
         <w:rPr>
-          <w:sz w:val="16"/>
-          <w:szCs w:val="16"/>
-        </w:rPr>
-        <w:t xml:space="preserve">Tempo e Clima 04/08/2026 - 12:41 El Niño reforça importância da nutrição das plantas para reduzir perdas no campo</w:t>
+          <w:sz w:val="17"/>
+          <w:szCs w:val="17"/>
+        </w:rPr>
+        <w:t xml:space="preserve">Riscos a monitorar: duração do conflito e normalização do Estreito de Ormuz, ritmo real da oferta chinesa, preço do enxofre, câmbio, crédito rural apertado e clima (risco de El Niño forte).</w:t>
+      </w:r>
+    </w:p>
+    <w:p>
+      <w:pPr>
+        <w:spacing w:after="20" w:before="60"/>
+      </w:pPr>
+      <w:r>
+        <w:rPr>
+          <w:b/>
+          <w:bCs/>
+          <w:color w:val="1E2A44"/>
+          <w:sz w:val="17"/>
+          <w:szCs w:val="17"/>
+        </w:rPr>
+        <w:t xml:space="preserve">Notícias recentes do mercado (atualização automática):</w:t>
       </w:r>
     </w:p>
     <w:p>
@@ -2308,7 +2317,7 @@
           <w:sz w:val="16"/>
           <w:szCs w:val="16"/>
         </w:rPr>
-        <w:t xml:space="preserve">Agronegócio 30/06/2026 - 09:30 Mercado de fertilizantes amplia movimento de baixa com recuo da ureia, MAP e cloreto de potássio</w:t>
+        <w:t xml:space="preserve">Agronegócio 14/09/2026 - 15:20 Importações de nitrogenados caem e acendem alerta para estoques no Brasil</w:t>
       </w:r>
     </w:p>
     <w:p>
@@ -2325,7 +2334,7 @@
           <w:sz w:val="16"/>
           <w:szCs w:val="16"/>
         </w:rPr>
-        <w:t xml:space="preserve">Agronegócio 19/06/2026 - 11:01 Importação dos EUA de fertilizante com origem no Oriente Médio zera em maio</w:t>
+        <w:t xml:space="preserve">Tempo e Clima 04/08/2026 - 12:41 El Niño reforça importância da nutrição das plantas para reduzir perdas no campo</w:t>
       </w:r>
     </w:p>
     <w:p>
@@ -2342,7 +2351,24 @@
           <w:sz w:val="16"/>
           <w:szCs w:val="16"/>
         </w:rPr>
-        <w:t xml:space="preserve">Agronegócio 16/06/2026 - 16:30 Ureia cai mais de 40% e volta ao nível pré-crise com avanço de acordo entre EUA e Irã</w:t>
+        <w:t xml:space="preserve">Agronegócio 30/06/2026 - 09:30 Mercado de fertilizantes amplia movimento de baixa com recuo da ureia, MAP e cloreto de potássio</w:t>
+      </w:r>
+    </w:p>
+    <w:p>
+      <w:pPr>
+        <w:pStyle w:val="ListParagraph"/>
+        <w:numPr>
+          <w:ilvl w:val="0"/>
+          <w:numId w:val="2"/>
+        </w:numPr>
+        <w:spacing w:after="70"/>
+      </w:pPr>
+      <w:r>
+        <w:rPr>
+          <w:sz w:val="16"/>
+          <w:szCs w:val="16"/>
+        </w:rPr>
+        <w:t xml:space="preserve">Agronegócio 19/06/2026 - 11:01 Importação dos EUA de fertilizante com origem no Oriente Médio zera em maio</w:t>
       </w:r>
     </w:p>
     <w:p>
@@ -2431,7 +2457,7 @@
           <w:sz w:val="15"/>
           <w:szCs w:val="15"/>
         </w:rPr>
-        <w:t xml:space="preserve">Fontes automáticas: AwesomeAPI (câmbio), CEPEA/ESALQ (soja), stooq (BDI). Fertilizantes e gás natural: override manual (fertilizers-override.json). Status desta execução: {"sojaRegional":"ok (Oeste da Bahia/BA (AIBA))","bdi":"ok (HANDYBULK, 11/09/2026)","soja":"ok (Noticias Agricolas / CEPEA-PR 11/09/2026)","cambio":"ok (BCB PTAX)","_comexRetry":"aguardando 15s apos 429 (com-filtro-ncm 2026-08, tentativa 2)","_comexPeriodo":"com-filtro-ncm | 2026-08 | 4 linhas","_comexNcmsEncontrados":"31042090,31021010,31054000,31042010","ureia":"ok (ComexStat 2026-08)","map":"ok (ComexStat 2026-08)","kcl":"ok (ComexStat 2026-08)","gas":"ok (EIA Henry Hub)","noticias":"ok (40 de https://www.noticiasagricolas.com.br/tags/fertilizantes/)"}.</w:t>
+        <w:t xml:space="preserve">Fontes automáticas: AwesomeAPI (câmbio), CEPEA/ESALQ (soja), stooq (BDI). Fertilizantes e gás natural: override manual (fertilizers-override.json). Status desta execução: {"bdi":"ok (HANDYBULK, 14/09/2026)","sojaRegional":"ok (Oeste da Bahia/BA (AIBA))","soja":"ok (Noticias Agricolas / CEPEA-PR 14/09/2026)","cambio":"ok (BCB PTAX)","_comexDiag":"sem-filtro 2026-04: HTTP 403 :: &lt;!DOCTYPE html&gt; &lt;!--[if lt IE 7]&gt; &lt;html class=\"no-js ie6 oldie\" lang=\"en-US\"&gt; &lt;![endif]--&gt; &lt;!--[if I","ureia":"falha: sem-filtro 2026-04: HTTP 403 :: &lt;!DOCTYPE html&gt; &lt;!--[if lt IE 7]&gt; &lt;html class=\"no-js ie6 oldie\" lang=\"en-US\"&gt; &lt;![endif]--&gt; &lt;!--[if I","map":"falha: sem-filtro 2026-04: HTTP 403 :: &lt;!DOCTYPE html&gt; &lt;!--[if lt IE 7]&gt; &lt;html class=\"no-js ie6 oldie\" lang=\"en-US\"&gt; &lt;![endif]--&gt; &lt;!--[if I","kcl":"falha: sem-filtro 2026-04: HTTP 403 :: &lt;!DOCTYPE html&gt; &lt;!--[if lt IE 7]&gt; &lt;html class=\"no-js ie6 oldie\" lang=\"en-US\"&gt; &lt;![endif]--&gt; &lt;!--[if I","gas":"ok (EIA Henry Hub)","noticias":"ok (40 de https://www.noticiasagricolas.com.br/tags/fertilizantes/)"}.</w:t>
       </w:r>
     </w:p>
     <w:p>

</xml_diff>

<commit_message>
chore: atualizacao automatica 2026-09-16
</commit_message>
<xml_diff>
--- a/relatorio_executivo.docx
+++ b/relatorio_executivo.docx
@@ -46,7 +46,7 @@
           <w:sz w:val="17"/>
           <w:szCs w:val="17"/>
         </w:rPr>
-        <w:t xml:space="preserve">Equipe de Planejamento, Controle e Pesquisa Florestal  ·  Referência: Set/2026  ·  Gerado em 15/09/2026, 10:52:38</w:t>
+        <w:t xml:space="preserve">Equipe de Planejamento, Controle e Pesquisa Florestal  ·  Referência: Set/2026  ·  Gerado em 16/09/2026, 11:52:30</w:t>
       </w:r>
     </w:p>
     <w:p>
@@ -84,21 +84,21 @@
           <w:sz w:val="19"/>
           <w:szCs w:val="19"/>
         </w:rPr>
-        <w:t xml:space="preserve">Ureia FOB em US$ 491/t (+18,9%), MAP US$ 640/t e KCl US$ 328/t. </w:t>
+        <w:t xml:space="preserve">Ureia FOB em US$ 413/t (fechamento ago/26), MAP US$ 834/t e KCl US$ 352/t. </w:t>
       </w:r>
       <w:r>
         <w:rPr>
           <w:sz w:val="19"/>
           <w:szCs w:val="19"/>
         </w:rPr>
-        <w:t xml:space="preserve">O dólar está em R$ 5,17 (+1,6%) e a soja CEPEA em R$ 152,90/saca. </w:t>
+        <w:t xml:space="preserve">O dólar está em R$ 5,15 (-0,4%) e a soja CEPEA em R$ 153,59/saca. </w:t>
       </w:r>
       <w:r>
         <w:rPr>
           <w:sz w:val="19"/>
           <w:szCs w:val="19"/>
         </w:rPr>
-        <w:t xml:space="preserve">A relação de troca soja/MAP é de 22,4 sacas/t.</w:t>
+        <w:t xml:space="preserve">A relação de troca soja/MAP é de 28,8 sacas/t.</w:t>
       </w:r>
     </w:p>
     <w:p>
@@ -323,7 +323,7 @@
                 <w:sz w:val="18"/>
                 <w:szCs w:val="18"/>
               </w:rPr>
-              <w:t xml:space="preserve">US$ 491/t</w:t>
+              <w:t xml:space="preserve">US$ 413/t</w:t>
             </w:r>
           </w:p>
         </w:tc>
@@ -352,11 +352,11 @@
               <w:rPr>
                 <w:b/>
                 <w:bCs/>
-                <w:color w:val="B23636"/>
-                <w:sz w:val="18"/>
-                <w:szCs w:val="18"/>
-              </w:rPr>
-              <w:t xml:space="preserve">+18,9%</w:t>
+                <w:color w:val="6B7585"/>
+                <w:sz w:val="18"/>
+                <w:szCs w:val="18"/>
+              </w:rPr>
+              <w:t xml:space="preserve">—</w:t>
             </w:r>
           </w:p>
         </w:tc>
@@ -386,7 +386,7 @@
                 <w:sz w:val="17"/>
                 <w:szCs w:val="17"/>
               </w:rPr>
-              <w:t xml:space="preserve">Nitrogenado · ref. ago/26</w:t>
+              <w:t xml:space="preserve">Fechamento ago/26 (sem novo dado)</w:t>
             </w:r>
           </w:p>
         </w:tc>
@@ -448,7 +448,7 @@
                 <w:sz w:val="18"/>
                 <w:szCs w:val="18"/>
               </w:rPr>
-              <w:t xml:space="preserve">US$ 640/t</w:t>
+              <w:t xml:space="preserve">US$ 834/t</w:t>
             </w:r>
           </w:p>
         </w:tc>
@@ -477,11 +477,11 @@
               <w:rPr>
                 <w:b/>
                 <w:bCs/>
-                <w:color w:val="2F8A5F"/>
-                <w:sz w:val="18"/>
-                <w:szCs w:val="18"/>
-              </w:rPr>
-              <w:t xml:space="preserve">-23,3%</w:t>
+                <w:color w:val="6B7585"/>
+                <w:sz w:val="18"/>
+                <w:szCs w:val="18"/>
+              </w:rPr>
+              <w:t xml:space="preserve">—</w:t>
             </w:r>
           </w:p>
         </w:tc>
@@ -511,7 +511,7 @@
                 <w:sz w:val="17"/>
                 <w:szCs w:val="17"/>
               </w:rPr>
-              <w:t xml:space="preserve">Fosfatado · ref. ago/26</w:t>
+              <w:t xml:space="preserve">Fechamento ago/26 (sem novo dado)</w:t>
             </w:r>
           </w:p>
         </w:tc>
@@ -573,7 +573,7 @@
                 <w:sz w:val="18"/>
                 <w:szCs w:val="18"/>
               </w:rPr>
-              <w:t xml:space="preserve">US$ 328/t</w:t>
+              <w:t xml:space="preserve">US$ 352/t</w:t>
             </w:r>
           </w:p>
         </w:tc>
@@ -602,11 +602,11 @@
               <w:rPr>
                 <w:b/>
                 <w:bCs/>
-                <w:color w:val="2F8A5F"/>
-                <w:sz w:val="18"/>
-                <w:szCs w:val="18"/>
-              </w:rPr>
-              <w:t xml:space="preserve">-6,8%</w:t>
+                <w:color w:val="6B7585"/>
+                <w:sz w:val="18"/>
+                <w:szCs w:val="18"/>
+              </w:rPr>
+              <w:t xml:space="preserve">—</w:t>
             </w:r>
           </w:p>
         </w:tc>
@@ -636,7 +636,7 @@
                 <w:sz w:val="17"/>
                 <w:szCs w:val="17"/>
               </w:rPr>
-              <w:t xml:space="preserve">Potássico · ref. ago/26</w:t>
+              <w:t xml:space="preserve">Fechamento ago/26 (sem novo dado)</w:t>
             </w:r>
           </w:p>
         </w:tc>
@@ -864,7 +864,7 @@
                 <w:sz w:val="18"/>
                 <w:szCs w:val="18"/>
               </w:rPr>
-              <w:t xml:space="preserve">R$ 152,90/sc</w:t>
+              <w:t xml:space="preserve">R$ 153,59/sc</w:t>
             </w:r>
           </w:p>
         </w:tc>
@@ -893,11 +893,11 @@
               <w:rPr>
                 <w:b/>
                 <w:bCs/>
-                <w:color w:val="6B7585"/>
-                <w:sz w:val="18"/>
-                <w:szCs w:val="18"/>
-              </w:rPr>
-              <w:t xml:space="preserve">+0,1%</w:t>
+                <w:color w:val="2F8A5F"/>
+                <w:sz w:val="18"/>
+                <w:szCs w:val="18"/>
+              </w:rPr>
+              <w:t xml:space="preserve">+0,5%</w:t>
             </w:r>
           </w:p>
         </w:tc>
@@ -989,7 +989,7 @@
                 <w:sz w:val="18"/>
                 <w:szCs w:val="18"/>
               </w:rPr>
-              <w:t xml:space="preserve">R$ 146,00/sc</w:t>
+              <w:t xml:space="preserve">R$ 144,75/sc</w:t>
             </w:r>
           </w:p>
         </w:tc>
@@ -1022,7 +1022,7 @@
                 <w:sz w:val="18"/>
                 <w:szCs w:val="18"/>
               </w:rPr>
-              <w:t xml:space="preserve">-2,0%</w:t>
+              <w:t xml:space="preserve">-0,9%</w:t>
             </w:r>
           </w:p>
         </w:tc>
@@ -1114,7 +1114,7 @@
                 <w:sz w:val="18"/>
                 <w:szCs w:val="18"/>
               </w:rPr>
-              <w:t xml:space="preserve">22,4 sc/t</w:t>
+              <w:t xml:space="preserve">28,8 sc/t</w:t>
             </w:r>
           </w:p>
         </w:tc>
@@ -1143,11 +1143,11 @@
               <w:rPr>
                 <w:b/>
                 <w:bCs/>
-                <w:color w:val="2F8A5F"/>
-                <w:sz w:val="18"/>
-                <w:szCs w:val="18"/>
-              </w:rPr>
-              <w:t xml:space="preserve">-21,7%</w:t>
+                <w:color w:val="B23636"/>
+                <w:sz w:val="18"/>
+                <w:szCs w:val="18"/>
+              </w:rPr>
+              <w:t xml:space="preserve">+28,6%</w:t>
             </w:r>
           </w:p>
         </w:tc>
@@ -1177,7 +1177,7 @@
                 <w:sz w:val="17"/>
                 <w:szCs w:val="17"/>
               </w:rPr>
-              <w:t xml:space="preserve">Melhora</w:t>
+              <w:t xml:space="preserve">Piora</w:t>
             </w:r>
           </w:p>
         </w:tc>
@@ -1239,7 +1239,7 @@
                 <w:sz w:val="18"/>
                 <w:szCs w:val="18"/>
               </w:rPr>
-              <w:t xml:space="preserve">17,3 sc/t</w:t>
+              <w:t xml:space="preserve">14,5 sc/t</w:t>
             </w:r>
           </w:p>
         </w:tc>
@@ -1528,7 +1528,7 @@
                 <w:sz w:val="18"/>
                 <w:szCs w:val="18"/>
               </w:rPr>
-              <w:t xml:space="preserve">5,17</w:t>
+              <w:t xml:space="preserve">5,15</w:t>
             </w:r>
           </w:p>
         </w:tc>
@@ -1557,11 +1557,11 @@
               <w:rPr>
                 <w:b/>
                 <w:bCs/>
-                <w:color w:val="B23636"/>
-                <w:sz w:val="18"/>
-                <w:szCs w:val="18"/>
-              </w:rPr>
-              <w:t xml:space="preserve">+1,6%</w:t>
+                <w:color w:val="2F8A5F"/>
+                <w:sz w:val="18"/>
+                <w:szCs w:val="18"/>
+              </w:rPr>
+              <w:t xml:space="preserve">-0,4%</w:t>
             </w:r>
           </w:p>
         </w:tc>
@@ -1778,7 +1778,7 @@
                 <w:sz w:val="18"/>
                 <w:szCs w:val="18"/>
               </w:rPr>
-              <w:t xml:space="preserve">3.445 pts</w:t>
+              <w:t xml:space="preserve">3.360 pts</w:t>
             </w:r>
           </w:p>
         </w:tc>
@@ -1811,7 +1811,7 @@
                 <w:sz w:val="18"/>
                 <w:szCs w:val="18"/>
               </w:rPr>
-              <w:t xml:space="preserve">-1,8%</w:t>
+              <w:t xml:space="preserve">-2,5%</w:t>
             </w:r>
           </w:p>
         </w:tc>
@@ -1881,14 +1881,90 @@
           <w:sz w:val="18"/>
           <w:szCs w:val="18"/>
         </w:rPr>
-        <w:t xml:space="preserve">MAP: </w:t>
+        <w:t xml:space="preserve">BDI: </w:t>
       </w:r>
       <w:r>
         <w:rPr>
           <w:sz w:val="18"/>
           <w:szCs w:val="18"/>
         </w:rPr>
-        <w:t xml:space="preserve">queda de -23,3% no período.</w:t>
+        <w:t xml:space="preserve">queda de -2,5% no período.</w:t>
+      </w:r>
+    </w:p>
+    <w:p>
+      <w:pPr>
+        <w:pBdr>
+          <w:bottom w:val="single" w:color="1E2A44" w:sz="6" w:space="2"/>
+        </w:pBdr>
+        <w:spacing w:after="100" w:before="220"/>
+      </w:pPr>
+      <w:r>
+        <w:rPr>
+          <w:b/>
+          <w:bCs/>
+          <w:color w:val="1E2A44"/>
+          <w:sz w:val="22"/>
+          <w:szCs w:val="22"/>
+        </w:rPr>
+        <w:t xml:space="preserve">6. Contexto de Mercado — Causas da Alta e Perspectivas</w:t>
+      </w:r>
+    </w:p>
+    <w:p>
+      <w:pPr>
+        <w:spacing w:after="60"/>
+      </w:pPr>
+      <w:r>
+        <w:rPr>
+          <w:b/>
+          <w:bCs/>
+          <w:color w:val="1E2A44"/>
+          <w:sz w:val="18"/>
+          <w:szCs w:val="18"/>
+        </w:rPr>
+        <w:t xml:space="preserve">Por que os fertilizantes subiram — e o que esperar · atualizado em Setembro/2026 · revisão manual.</w:t>
+      </w:r>
+    </w:p>
+    <w:p>
+      <w:pPr>
+        <w:spacing w:after="60"/>
+        <w:jc w:val="both"/>
+      </w:pPr>
+      <w:r>
+        <w:rPr>
+          <w:sz w:val="18"/>
+          <w:szCs w:val="18"/>
+        </w:rPr>
+        <w:t xml:space="preserve">Em setembro o quadro é de alívio parcial, não de normalização: os preços recuaram dos picos e a China voltou a exportar, mas a oferta segue apertada — sobretudo nos fosfatados (MAP) — e o abastecimento da safra 2026/27 virou a principal preocupação, com importações atrasadas e o governo atuando na logística dos portos.</w:t>
+      </w:r>
+    </w:p>
+    <w:p>
+      <w:pPr>
+        <w:spacing w:after="80"/>
+      </w:pPr>
+      <w:r>
+        <w:rPr>
+          <w:i/>
+          <w:iCs/>
+          <w:color w:val="6B7585"/>
+          <w:sz w:val="17"/>
+          <w:szCs w:val="17"/>
+        </w:rPr>
+        <w:t xml:space="preserve">Leitura automática: sem novo fechamento de fertilizantes desde a leitura anterior (ago/26).</w:t>
+      </w:r>
+    </w:p>
+    <w:p>
+      <w:pPr>
+        <w:spacing w:after="40"/>
+      </w:pPr>
+      <w:r>
+        <w:rPr>
+          <w:b/>
+          <w:bCs/>
+          <w:color w:val="1E2A44"/>
+          <w:sz w:val="18"/>
+          <w:szCs w:val="18"/>
+        </w:rPr>
+        <w:t xml:space="preserve">Principais causas da alta:</w:t>
       </w:r>
     </w:p>
     <w:p>
@@ -1904,17 +1980,17 @@
         <w:rPr>
           <w:b/>
           <w:bCs/>
-          <w:sz w:val="18"/>
-          <w:szCs w:val="18"/>
-        </w:rPr>
-        <w:t xml:space="preserve">Ureia: </w:t>
-      </w:r>
-      <w:r>
-        <w:rPr>
-          <w:sz w:val="18"/>
-          <w:szCs w:val="18"/>
-        </w:rPr>
-        <w:t xml:space="preserve">alta de +18,9% no período.</w:t>
+          <w:sz w:val="17"/>
+          <w:szCs w:val="17"/>
+        </w:rPr>
+        <w:t xml:space="preserve">Fosfatados (MAP) ainda pressionados: </w:t>
+      </w:r>
+      <w:r>
+        <w:rPr>
+          <w:sz w:val="17"/>
+          <w:szCs w:val="17"/>
+        </w:rPr>
+        <w:t xml:space="preserve">É o segmento mais crítico. As importações brasileiras de MAP caíram cerca de 24% no 1º semestre; a oferta chinesa, mesmo com retomada parcial, ainda é limitada, e a escassez de enxofre (matéria-prima do MAP) mantém o custo alto.</w:t>
       </w:r>
     </w:p>
     <w:p>
@@ -1930,17 +2006,17 @@
         <w:rPr>
           <w:b/>
           <w:bCs/>
-          <w:sz w:val="18"/>
-          <w:szCs w:val="18"/>
-        </w:rPr>
-        <w:t xml:space="preserve">KCl: </w:t>
-      </w:r>
-      <w:r>
-        <w:rPr>
-          <w:sz w:val="18"/>
-          <w:szCs w:val="18"/>
-        </w:rPr>
-        <w:t xml:space="preserve">queda de -6,8% no período.</w:t>
+          <w:sz w:val="17"/>
+          <w:szCs w:val="17"/>
+        </w:rPr>
+        <w:t xml:space="preserve">Escassez de enxofre: </w:t>
+      </w:r>
+      <w:r>
+        <w:rPr>
+          <w:sz w:val="17"/>
+          <w:szCs w:val="17"/>
+        </w:rPr>
+        <w:t xml:space="preserve">Insumo essencial dos fosfatados, o enxofre saltou de cerca de US$ 100/t no pré-guerra para a faixa de US$ 1.200/t, levando fábricas a reduzir produção e apertando ainda mais a oferta de MAP.</w:t>
       </w:r>
     </w:p>
     <w:p>
@@ -1956,93 +2032,17 @@
         <w:rPr>
           <w:b/>
           <w:bCs/>
-          <w:sz w:val="18"/>
-          <w:szCs w:val="18"/>
-        </w:rPr>
-        <w:t xml:space="preserve">BDI: </w:t>
-      </w:r>
-      <w:r>
-        <w:rPr>
-          <w:sz w:val="18"/>
-          <w:szCs w:val="18"/>
-        </w:rPr>
-        <w:t xml:space="preserve">queda de -1,8% no período.</w:t>
-      </w:r>
-    </w:p>
-    <w:p>
-      <w:pPr>
-        <w:pBdr>
-          <w:bottom w:val="single" w:color="1E2A44" w:sz="6" w:space="2"/>
-        </w:pBdr>
-        <w:spacing w:after="100" w:before="220"/>
-      </w:pPr>
-      <w:r>
-        <w:rPr>
-          <w:b/>
-          <w:bCs/>
-          <w:color w:val="1E2A44"/>
-          <w:sz w:val="22"/>
-          <w:szCs w:val="22"/>
-        </w:rPr>
-        <w:t xml:space="preserve">6. Contexto de Mercado — Causas da Alta e Perspectivas</w:t>
-      </w:r>
-    </w:p>
-    <w:p>
-      <w:pPr>
-        <w:spacing w:after="60"/>
-      </w:pPr>
-      <w:r>
-        <w:rPr>
-          <w:b/>
-          <w:bCs/>
-          <w:color w:val="1E2A44"/>
-          <w:sz w:val="18"/>
-          <w:szCs w:val="18"/>
-        </w:rPr>
-        <w:t xml:space="preserve">Por que os fertilizantes subiram — e o que esperar · atualizado em Setembro/2026 · revisão manual.</w:t>
-      </w:r>
-    </w:p>
-    <w:p>
-      <w:pPr>
-        <w:spacing w:after="60"/>
-        <w:jc w:val="both"/>
-      </w:pPr>
-      <w:r>
-        <w:rPr>
-          <w:sz w:val="18"/>
-          <w:szCs w:val="18"/>
-        </w:rPr>
-        <w:t xml:space="preserve">Em setembro o quadro é de alívio parcial, não de normalização: os preços recuaram dos picos e a China voltou a exportar, mas a oferta segue apertada — sobretudo nos fosfatados (MAP) — e o abastecimento da safra 2026/27 virou a principal preocupação, com importações atrasadas e o governo atuando na logística dos portos.</w:t>
-      </w:r>
-    </w:p>
-    <w:p>
-      <w:pPr>
-        <w:spacing w:after="80"/>
-      </w:pPr>
-      <w:r>
-        <w:rPr>
-          <w:i/>
-          <w:iCs/>
-          <w:color w:val="6B7585"/>
           <w:sz w:val="17"/>
           <w:szCs w:val="17"/>
         </w:rPr>
-        <w:t xml:space="preserve">Leitura automática — último fechamento (ago/26): Ureia +18,9%, MAP -23,3%, KCl -6,8% ante o mês anterior.</w:t>
-      </w:r>
-    </w:p>
-    <w:p>
-      <w:pPr>
-        <w:spacing w:after="40"/>
-      </w:pPr>
-      <w:r>
-        <w:rPr>
-          <w:b/>
-          <w:bCs/>
-          <w:color w:val="1E2A44"/>
-          <w:sz w:val="18"/>
-          <w:szCs w:val="18"/>
-        </w:rPr>
-        <w:t xml:space="preserve">Principais causas da alta:</w:t>
+        <w:t xml:space="preserve">China retomou exportações (alívio parcial): </w:t>
+      </w:r>
+      <w:r>
+        <w:rPr>
+          <w:sz w:val="17"/>
+          <w:szCs w:val="17"/>
+        </w:rPr>
+        <w:t xml:space="preserve">A volta gradual dos embarques chineses trouxe algum alívio a nitrogenados e fosfatados, mas ainda não elimina o risco de desabastecimento para a safra 2026/27.</w:t>
       </w:r>
     </w:p>
     <w:p>
@@ -2061,14 +2061,14 @@
           <w:sz w:val="17"/>
           <w:szCs w:val="17"/>
         </w:rPr>
-        <w:t xml:space="preserve">Fosfatados (MAP) ainda pressionados: </w:t>
+        <w:t xml:space="preserve">Importações atrasadas e cautelosas: </w:t>
       </w:r>
       <w:r>
         <w:rPr>
           <w:sz w:val="17"/>
           <w:szCs w:val="17"/>
         </w:rPr>
-        <w:t xml:space="preserve">É o segmento mais crítico. As importações brasileiras de MAP caíram cerca de 24% no 1º semestre; a oferta chinesa, mesmo com retomada parcial, ainda é limitada, e a escassez de enxofre (matéria-prima do MAP) mantém o custo alto.</w:t>
+        <w:t xml:space="preserve">No 1º semestre os desembarques totais caíram ~8,6% (ureia −32%, MAP −24%), com compradores adiando negócios diante da volatilidade e da relação de troca ruim. O tempo para garantir o abastecimento do plantio (set–out) ficou curto.</w:t>
       </w:r>
     </w:p>
     <w:p>
@@ -2087,14 +2087,42 @@
           <w:sz w:val="17"/>
           <w:szCs w:val="17"/>
         </w:rPr>
-        <w:t xml:space="preserve">Escassez de enxofre: </w:t>
+        <w:t xml:space="preserve">Oriente Médio e logística: </w:t>
       </w:r>
       <w:r>
         <w:rPr>
           <w:sz w:val="17"/>
           <w:szCs w:val="17"/>
         </w:rPr>
-        <w:t xml:space="preserve">Insumo essencial dos fosfatados, o enxofre saltou de cerca de US$ 100/t no pré-guerra para a faixa de US$ 1.200/t, levando fábricas a reduzir produção e apertando ainda mais a oferta de MAP.</w:t>
+        <w:t xml:space="preserve">As tensões e a disrupção de rotas ligadas ao Estreito de Ormuz afetaram ureia, amônia, enxofre e fosfatos, e ainda pesam sobre o frete e a previsibilidade das entregas.</w:t>
+      </w:r>
+    </w:p>
+    <w:p>
+      <w:pPr>
+        <w:spacing w:after="80" w:before="40"/>
+        <w:jc w:val="both"/>
+      </w:pPr>
+      <w:r>
+        <w:rPr>
+          <w:sz w:val="17"/>
+          <w:szCs w:val="17"/>
+        </w:rPr>
+        <w:t xml:space="preserve">No 1º semestre de 2026 as importações brasileiras das principais matérias-primas caíram ~8,6%, com ureia −32%, MAP −24% e enxofre −42% (StoneX). A ureia recuou dos picos do meio do ano, mas a relação de troca segue desfavorável — o Brasil importou cerca de 7% menos fertilizante e ainda assim o produtor gastou mais. A RaboResearch reduziu a projeção de entregas no país para ~45,1 milhões de toneladas em 2026, abaixo do recorde de 2025.</w:t>
+      </w:r>
+    </w:p>
+    <w:p>
+      <w:pPr>
+        <w:spacing w:after="40" w:before="40"/>
+      </w:pPr>
+      <w:r>
+        <w:rPr>
+          <w:b/>
+          <w:bCs/>
+          <w:color w:val="1E2A44"/>
+          <w:sz w:val="18"/>
+          <w:szCs w:val="18"/>
+        </w:rPr>
+        <w:t xml:space="preserve">O que esperar nos próximos meses:</w:t>
       </w:r>
     </w:p>
     <w:p>
@@ -2108,19 +2136,10 @@
       </w:pPr>
       <w:r>
         <w:rPr>
-          <w:b/>
-          <w:bCs/>
           <w:sz w:val="17"/>
           <w:szCs w:val="17"/>
         </w:rPr>
-        <w:t xml:space="preserve">China retomou exportações (alívio parcial): </w:t>
-      </w:r>
-      <w:r>
-        <w:rPr>
-          <w:sz w:val="17"/>
-          <w:szCs w:val="17"/>
-        </w:rPr>
-        <w:t xml:space="preserve">A volta gradual dos embarques chineses trouxe algum alívio a nitrogenados e fosfatados, mas ainda não elimina o risco de desabastecimento para a safra 2026/27.</w:t>
+        <w:t xml:space="preserve">Ureia (nitrogenados): preços fora dos extremos e acessibilidade em recuperação desde julho; espera-se retomada gradual das compras até o fim do ano, mas atrasos podem pressionar a 2ª safra de milho (plantio em jan/2027).</w:t>
       </w:r>
     </w:p>
     <w:p>
@@ -2134,19 +2153,10 @@
       </w:pPr>
       <w:r>
         <w:rPr>
-          <w:b/>
-          <w:bCs/>
           <w:sz w:val="17"/>
           <w:szCs w:val="17"/>
         </w:rPr>
-        <w:t xml:space="preserve">Importações atrasadas e cautelosas: </w:t>
-      </w:r>
-      <w:r>
-        <w:rPr>
-          <w:sz w:val="17"/>
-          <w:szCs w:val="17"/>
-        </w:rPr>
-        <w:t xml:space="preserve">No 1º semestre os desembarques totais caíram ~8,6% (ureia −32%, MAP −24%), com compradores adiando negócios diante da volatilidade e da relação de troca ruim. O tempo para garantir o abastecimento do plantio (set–out) ficou curto.</w:t>
+        <w:t xml:space="preserve">MAP (fosfatados): segue o ponto mais delicado; oferta apertada e enxofre caro limitam quedas, com risco de faltar produto no pico de plantio (set–out).</w:t>
       </w:r>
     </w:p>
     <w:p>
@@ -2160,47 +2170,10 @@
       </w:pPr>
       <w:r>
         <w:rPr>
-          <w:b/>
-          <w:bCs/>
           <w:sz w:val="17"/>
           <w:szCs w:val="17"/>
         </w:rPr>
-        <w:t xml:space="preserve">Oriente Médio e logística: </w:t>
-      </w:r>
-      <w:r>
-        <w:rPr>
-          <w:sz w:val="17"/>
-          <w:szCs w:val="17"/>
-        </w:rPr>
-        <w:t xml:space="preserve">As tensões e a disrupção de rotas ligadas ao Estreito de Ormuz afetaram ureia, amônia, enxofre e fosfatos, e ainda pesam sobre o frete e a previsibilidade das entregas.</w:t>
-      </w:r>
-    </w:p>
-    <w:p>
-      <w:pPr>
-        <w:spacing w:after="80" w:before="40"/>
-        <w:jc w:val="both"/>
-      </w:pPr>
-      <w:r>
-        <w:rPr>
-          <w:sz w:val="17"/>
-          <w:szCs w:val="17"/>
-        </w:rPr>
-        <w:t xml:space="preserve">No 1º semestre de 2026 as importações brasileiras das principais matérias-primas caíram ~8,6%, com ureia −32%, MAP −24% e enxofre −42% (StoneX). A ureia recuou dos picos do meio do ano, mas a relação de troca segue desfavorável — o Brasil importou cerca de 7% menos fertilizante e ainda assim o produtor gastou mais. A RaboResearch reduziu a projeção de entregas no país para ~45,1 milhões de toneladas em 2026, abaixo do recorde de 2025.</w:t>
-      </w:r>
-    </w:p>
-    <w:p>
-      <w:pPr>
-        <w:spacing w:after="40" w:before="40"/>
-      </w:pPr>
-      <w:r>
-        <w:rPr>
-          <w:b/>
-          <w:bCs/>
-          <w:color w:val="1E2A44"/>
-          <w:sz w:val="18"/>
-          <w:szCs w:val="18"/>
-        </w:rPr>
-        <w:t xml:space="preserve">O que esperar nos próximos meses:</w:t>
+        <w:t xml:space="preserve">KCl (potássio): segmento mais confortável e com preços entre os mais favoráveis em anos; boa janela de reposição.</w:t>
       </w:r>
     </w:p>
     <w:p>
@@ -2217,7 +2190,7 @@
           <w:sz w:val="17"/>
           <w:szCs w:val="17"/>
         </w:rPr>
-        <w:t xml:space="preserve">Ureia (nitrogenados): preços fora dos extremos e acessibilidade em recuperação desde julho; espera-se retomada gradual das compras até o fim do ano, mas atrasos podem pressionar a 2ª safra de milho (plantio em jan/2027).</w:t>
+        <w:t xml:space="preserve">Ação do governo: a Casa Civil mantém a Sala de Situação sobre Fertilizantes, e foi publicada resolução (ago/2026, validade de 6 meses) priorizando o desembarque de fertilizantes nos portos públicos para garantir o abastecimento da safra 2026/27.</w:t>
       </w:r>
     </w:p>
     <w:p>
@@ -2234,7 +2207,22 @@
           <w:sz w:val="17"/>
           <w:szCs w:val="17"/>
         </w:rPr>
-        <w:t xml:space="preserve">MAP (fosfatados): segue o ponto mais delicado; oferta apertada e enxofre caro limitam quedas, com risco de faltar produto no pico de plantio (set–out).</w:t>
+        <w:t xml:space="preserve">Riscos a monitorar: duração do conflito e normalização do Estreito de Ormuz, ritmo real da oferta chinesa, preço do enxofre, câmbio, crédito rural apertado e clima (risco de El Niño forte).</w:t>
+      </w:r>
+    </w:p>
+    <w:p>
+      <w:pPr>
+        <w:spacing w:after="20" w:before="60"/>
+      </w:pPr>
+      <w:r>
+        <w:rPr>
+          <w:b/>
+          <w:bCs/>
+          <w:color w:val="1E2A44"/>
+          <w:sz w:val="17"/>
+          <w:szCs w:val="17"/>
+        </w:rPr>
+        <w:t xml:space="preserve">Notícias recentes do mercado (atualização automática):</w:t>
       </w:r>
     </w:p>
     <w:p>
@@ -2248,10 +2236,10 @@
       </w:pPr>
       <w:r>
         <w:rPr>
-          <w:sz w:val="17"/>
-          <w:szCs w:val="17"/>
-        </w:rPr>
-        <w:t xml:space="preserve">KCl (potássio): segmento mais confortável e com preços entre os mais favoráveis em anos; boa janela de reposição.</w:t>
+          <w:sz w:val="16"/>
+          <w:szCs w:val="16"/>
+        </w:rPr>
+        <w:t xml:space="preserve">Agronegócio 14/09/2026 - 15:20 Importações de nitrogenados caem e acendem alerta para estoques no Brasil</w:t>
       </w:r>
     </w:p>
     <w:p>
@@ -2265,10 +2253,10 @@
       </w:pPr>
       <w:r>
         <w:rPr>
-          <w:sz w:val="17"/>
-          <w:szCs w:val="17"/>
-        </w:rPr>
-        <w:t xml:space="preserve">Ação do governo: a Casa Civil mantém a Sala de Situação sobre Fertilizantes, e foi publicada resolução (ago/2026, validade de 6 meses) priorizando o desembarque de fertilizantes nos portos públicos para garantir o abastecimento da safra 2026/27.</w:t>
+          <w:sz w:val="16"/>
+          <w:szCs w:val="16"/>
+        </w:rPr>
+        <w:t xml:space="preserve">Tempo e Clima 04/08/2026 - 12:41 El Niño reforça importância da nutrição das plantas para reduzir perdas no campo</w:t>
       </w:r>
     </w:p>
     <w:p>
@@ -2282,25 +2270,10 @@
       </w:pPr>
       <w:r>
         <w:rPr>
-          <w:sz w:val="17"/>
-          <w:szCs w:val="17"/>
-        </w:rPr>
-        <w:t xml:space="preserve">Riscos a monitorar: duração do conflito e normalização do Estreito de Ormuz, ritmo real da oferta chinesa, preço do enxofre, câmbio, crédito rural apertado e clima (risco de El Niño forte).</w:t>
-      </w:r>
-    </w:p>
-    <w:p>
-      <w:pPr>
-        <w:spacing w:after="20" w:before="60"/>
-      </w:pPr>
-      <w:r>
-        <w:rPr>
-          <w:b/>
-          <w:bCs/>
-          <w:color w:val="1E2A44"/>
-          <w:sz w:val="17"/>
-          <w:szCs w:val="17"/>
-        </w:rPr>
-        <w:t xml:space="preserve">Notícias recentes do mercado (atualização automática):</w:t>
+          <w:sz w:val="16"/>
+          <w:szCs w:val="16"/>
+        </w:rPr>
+        <w:t xml:space="preserve">Agronegócio 30/06/2026 - 09:30 Mercado de fertilizantes amplia movimento de baixa com recuo da ureia, MAP e cloreto de potássio</w:t>
       </w:r>
     </w:p>
     <w:p>
@@ -2317,57 +2290,6 @@
           <w:sz w:val="16"/>
           <w:szCs w:val="16"/>
         </w:rPr>
-        <w:t xml:space="preserve">Agronegócio 14/09/2026 - 15:20 Importações de nitrogenados caem e acendem alerta para estoques no Brasil</w:t>
-      </w:r>
-    </w:p>
-    <w:p>
-      <w:pPr>
-        <w:pStyle w:val="ListParagraph"/>
-        <w:numPr>
-          <w:ilvl w:val="0"/>
-          <w:numId w:val="2"/>
-        </w:numPr>
-        <w:spacing w:after="70"/>
-      </w:pPr>
-      <w:r>
-        <w:rPr>
-          <w:sz w:val="16"/>
-          <w:szCs w:val="16"/>
-        </w:rPr>
-        <w:t xml:space="preserve">Tempo e Clima 04/08/2026 - 12:41 El Niño reforça importância da nutrição das plantas para reduzir perdas no campo</w:t>
-      </w:r>
-    </w:p>
-    <w:p>
-      <w:pPr>
-        <w:pStyle w:val="ListParagraph"/>
-        <w:numPr>
-          <w:ilvl w:val="0"/>
-          <w:numId w:val="2"/>
-        </w:numPr>
-        <w:spacing w:after="70"/>
-      </w:pPr>
-      <w:r>
-        <w:rPr>
-          <w:sz w:val="16"/>
-          <w:szCs w:val="16"/>
-        </w:rPr>
-        <w:t xml:space="preserve">Agronegócio 30/06/2026 - 09:30 Mercado de fertilizantes amplia movimento de baixa com recuo da ureia, MAP e cloreto de potássio</w:t>
-      </w:r>
-    </w:p>
-    <w:p>
-      <w:pPr>
-        <w:pStyle w:val="ListParagraph"/>
-        <w:numPr>
-          <w:ilvl w:val="0"/>
-          <w:numId w:val="2"/>
-        </w:numPr>
-        <w:spacing w:after="70"/>
-      </w:pPr>
-      <w:r>
-        <w:rPr>
-          <w:sz w:val="16"/>
-          <w:szCs w:val="16"/>
-        </w:rPr>
         <w:t xml:space="preserve">Agronegócio 19/06/2026 - 11:01 Importação dos EUA de fertilizante com origem no Oriente Médio zera em maio</w:t>
       </w:r>
     </w:p>
@@ -2457,7 +2379,7 @@
           <w:sz w:val="15"/>
           <w:szCs w:val="15"/>
         </w:rPr>
-        <w:t xml:space="preserve">Fontes automáticas: AwesomeAPI (câmbio), CEPEA/ESALQ (soja), stooq (BDI). Fertilizantes e gás natural: override manual (fertilizers-override.json). Status desta execução: {"bdi":"ok (HANDYBULK, 14/09/2026)","sojaRegional":"ok (Oeste da Bahia/BA (AIBA))","soja":"ok (Noticias Agricolas / CEPEA-PR 14/09/2026)","cambio":"ok (BCB PTAX)","_comexDiag":"sem-filtro 2026-04: HTTP 403 :: &lt;!DOCTYPE html&gt; &lt;!--[if lt IE 7]&gt; &lt;html class=\"no-js ie6 oldie\" lang=\"en-US\"&gt; &lt;![endif]--&gt; &lt;!--[if I","ureia":"falha: sem-filtro 2026-04: HTTP 403 :: &lt;!DOCTYPE html&gt; &lt;!--[if lt IE 7]&gt; &lt;html class=\"no-js ie6 oldie\" lang=\"en-US\"&gt; &lt;![endif]--&gt; &lt;!--[if I","map":"falha: sem-filtro 2026-04: HTTP 403 :: &lt;!DOCTYPE html&gt; &lt;!--[if lt IE 7]&gt; &lt;html class=\"no-js ie6 oldie\" lang=\"en-US\"&gt; &lt;![endif]--&gt; &lt;!--[if I","kcl":"falha: sem-filtro 2026-04: HTTP 403 :: &lt;!DOCTYPE html&gt; &lt;!--[if lt IE 7]&gt; &lt;html class=\"no-js ie6 oldie\" lang=\"en-US\"&gt; &lt;![endif]--&gt; &lt;!--[if I","gas":"ok (EIA Henry Hub)","noticias":"ok (40 de https://www.noticiasagricolas.com.br/tags/fertilizantes/)"}.</w:t>
+        <w:t xml:space="preserve">Fontes automáticas: AwesomeAPI (câmbio), CEPEA/ESALQ (soja), stooq (BDI). Fertilizantes e gás natural: override manual (fertilizers-override.json). Status desta execução: {"sojaRegional":"ok (Oeste da Bahia/BA (AIBA))","cambio":"ok (BCB PTAX)","bdi":"ok (HANDYBULK, 15/09/2026)","soja":"ok (Noticias Agricolas / CEPEA-PR 15/09/2026)","_comexPeriodo":"com-filtro-ncm | 2026-08 | 4 linhas","_comexNcmsEncontrados":"31042090,31021010,31054000,31042010","ureia":"ok (ComexStat 2026-08)","map":"ok (ComexStat 2026-08)","kcl":"ok (ComexStat 2026-08)","gas":"ok (EIA Henry Hub)","noticias":"ok (40 de https://www.noticiasagricolas.com.br/tags/fertilizantes/)"}.</w:t>
       </w:r>
     </w:p>
     <w:p>

</xml_diff>